<commit_message>
Sua toan bo loi cong thuc long trong the bold va chuyen doi Bao cao muc tieu sang file Word
</commit_message>
<xml_diff>
--- a/Cẩm_Nang_Phản_Biện_Đồ_Án.docx
+++ b/Cẩm_Nang_Phản_Biện_Đồ_Án.docx
@@ -27,6 +27,8 @@
       <w:r>
         <w:rPr>
           <w:rFonts w:ascii="Times New Roman" w:hAnsi="Times New Roman"/>
+          <w:b w:val="0"/>
+          <w:i w:val="0"/>
           <w:sz w:val="24"/>
           <w:rFonts w:ascii="Times New Roman" w:hAnsi="Times New Roman" w:cs="Times New Roman" w:eastAsia="Times New Roman"/>
         </w:rPr>
@@ -42,6 +44,8 @@
       <w:r>
         <w:rPr>
           <w:rFonts w:ascii="Times New Roman" w:hAnsi="Times New Roman"/>
+          <w:b w:val="0"/>
+          <w:i w:val="0"/>
           <w:sz w:val="24"/>
           <w:rFonts w:ascii="Times New Roman" w:hAnsi="Times New Roman" w:cs="Times New Roman" w:eastAsia="Times New Roman"/>
         </w:rPr>
@@ -94,6 +98,7 @@
         <w:rPr>
           <w:rFonts w:ascii="Times New Roman" w:hAnsi="Times New Roman"/>
           <w:b/>
+          <w:i w:val="0"/>
           <w:sz w:val="24"/>
           <w:rFonts w:ascii="Times New Roman" w:hAnsi="Times New Roman" w:cs="Times New Roman" w:eastAsia="Times New Roman"/>
         </w:rPr>
@@ -102,6 +107,8 @@
       <w:r>
         <w:rPr>
           <w:rFonts w:ascii="Times New Roman" w:hAnsi="Times New Roman"/>
+          <w:b w:val="0"/>
+          <w:i w:val="0"/>
           <w:sz w:val="24"/>
           <w:rFonts w:ascii="Times New Roman" w:hAnsi="Times New Roman" w:cs="Times New Roman" w:eastAsia="Times New Roman"/>
         </w:rPr>
@@ -125,6 +132,8 @@
       <w:r>
         <w:rPr>
           <w:rFonts w:ascii="Times New Roman" w:hAnsi="Times New Roman"/>
+          <w:b w:val="0"/>
+          <w:i w:val="0"/>
           <w:sz w:val="24"/>
           <w:rFonts w:ascii="Times New Roman" w:hAnsi="Times New Roman" w:cs="Times New Roman" w:eastAsia="Times New Roman"/>
         </w:rPr>
@@ -148,6 +157,8 @@
       <w:r>
         <w:rPr>
           <w:rFonts w:ascii="Times New Roman" w:hAnsi="Times New Roman"/>
+          <w:b w:val="0"/>
+          <w:i w:val="0"/>
           <w:sz w:val="24"/>
           <w:rFonts w:ascii="Times New Roman" w:hAnsi="Times New Roman" w:cs="Times New Roman" w:eastAsia="Times New Roman"/>
         </w:rPr>
@@ -171,6 +182,8 @@
       <w:r>
         <w:rPr>
           <w:rFonts w:ascii="Times New Roman" w:hAnsi="Times New Roman"/>
+          <w:b w:val="0"/>
+          <w:i w:val="0"/>
           <w:sz w:val="24"/>
           <w:rFonts w:ascii="Times New Roman" w:hAnsi="Times New Roman" w:cs="Times New Roman" w:eastAsia="Times New Roman"/>
         </w:rPr>
@@ -194,6 +207,8 @@
       <w:r>
         <w:rPr>
           <w:rFonts w:ascii="Times New Roman" w:hAnsi="Times New Roman"/>
+          <w:b w:val="0"/>
+          <w:i w:val="0"/>
           <w:sz w:val="24"/>
           <w:rFonts w:ascii="Times New Roman" w:hAnsi="Times New Roman" w:cs="Times New Roman" w:eastAsia="Times New Roman"/>
         </w:rPr>
@@ -217,6 +232,8 @@
       <w:r>
         <w:rPr>
           <w:rFonts w:ascii="Times New Roman" w:hAnsi="Times New Roman"/>
+          <w:b w:val="0"/>
+          <w:i w:val="0"/>
           <w:sz w:val="24"/>
           <w:rFonts w:ascii="Times New Roman" w:hAnsi="Times New Roman" w:cs="Times New Roman" w:eastAsia="Times New Roman"/>
         </w:rPr>
@@ -240,6 +257,8 @@
       <w:r>
         <w:rPr>
           <w:rFonts w:ascii="Times New Roman" w:hAnsi="Times New Roman"/>
+          <w:b w:val="0"/>
+          <w:i w:val="0"/>
           <w:sz w:val="24"/>
           <w:rFonts w:ascii="Times New Roman" w:hAnsi="Times New Roman" w:cs="Times New Roman" w:eastAsia="Times New Roman"/>
         </w:rPr>
@@ -263,6 +282,8 @@
       <w:r>
         <w:rPr>
           <w:rFonts w:ascii="Times New Roman" w:hAnsi="Times New Roman"/>
+          <w:b w:val="0"/>
+          <w:i w:val="0"/>
           <w:sz w:val="24"/>
           <w:rFonts w:ascii="Times New Roman" w:hAnsi="Times New Roman" w:cs="Times New Roman" w:eastAsia="Times New Roman"/>
         </w:rPr>
@@ -278,6 +299,8 @@
       <w:r>
         <w:rPr>
           <w:rFonts w:ascii="Times New Roman" w:hAnsi="Times New Roman"/>
+          <w:b w:val="0"/>
+          <w:i w:val="0"/>
           <w:sz w:val="24"/>
           <w:rFonts w:ascii="Times New Roman" w:hAnsi="Times New Roman" w:cs="Times New Roman" w:eastAsia="Times New Roman"/>
         </w:rPr>
@@ -293,6 +316,8 @@
       <w:r>
         <w:rPr>
           <w:rFonts w:ascii="Times New Roman" w:hAnsi="Times New Roman"/>
+          <w:b w:val="0"/>
+          <w:i w:val="0"/>
           <w:sz w:val="24"/>
           <w:rFonts w:ascii="Times New Roman" w:hAnsi="Times New Roman" w:cs="Times New Roman" w:eastAsia="Times New Roman"/>
         </w:rPr>
@@ -327,6 +352,7 @@
         <w:rPr>
           <w:rFonts w:ascii="Times New Roman" w:hAnsi="Times New Roman"/>
           <w:b/>
+          <w:i w:val="0"/>
           <w:sz w:val="24"/>
           <w:rFonts w:ascii="Times New Roman" w:hAnsi="Times New Roman" w:cs="Times New Roman" w:eastAsia="Times New Roman"/>
         </w:rPr>
@@ -335,6 +361,8 @@
       <w:r>
         <w:rPr>
           <w:rFonts w:ascii="Times New Roman" w:hAnsi="Times New Roman"/>
+          <w:b w:val="0"/>
+          <w:i w:val="0"/>
           <w:sz w:val="24"/>
           <w:rFonts w:ascii="Times New Roman" w:hAnsi="Times New Roman" w:cs="Times New Roman" w:eastAsia="Times New Roman"/>
         </w:rPr>
@@ -358,6 +386,8 @@
       <w:r>
         <w:rPr>
           <w:rFonts w:ascii="Times New Roman" w:hAnsi="Times New Roman"/>
+          <w:b w:val="0"/>
+          <w:i w:val="0"/>
           <w:sz w:val="24"/>
           <w:rFonts w:ascii="Times New Roman" w:hAnsi="Times New Roman" w:cs="Times New Roman" w:eastAsia="Times New Roman"/>
         </w:rPr>
@@ -381,6 +411,8 @@
       <w:r>
         <w:rPr>
           <w:rFonts w:ascii="Times New Roman" w:hAnsi="Times New Roman"/>
+          <w:b w:val="0"/>
+          <w:i w:val="0"/>
           <w:sz w:val="24"/>
           <w:rFonts w:ascii="Times New Roman" w:hAnsi="Times New Roman" w:cs="Times New Roman" w:eastAsia="Times New Roman"/>
         </w:rPr>
@@ -404,6 +436,8 @@
       <w:r>
         <w:rPr>
           <w:rFonts w:ascii="Times New Roman" w:hAnsi="Times New Roman"/>
+          <w:b w:val="0"/>
+          <w:i w:val="0"/>
           <w:sz w:val="24"/>
           <w:rFonts w:ascii="Times New Roman" w:hAnsi="Times New Roman" w:cs="Times New Roman" w:eastAsia="Times New Roman"/>
         </w:rPr>
@@ -427,6 +461,8 @@
       <w:r>
         <w:rPr>
           <w:rFonts w:ascii="Times New Roman" w:hAnsi="Times New Roman"/>
+          <w:b w:val="0"/>
+          <w:i w:val="0"/>
           <w:sz w:val="24"/>
           <w:rFonts w:ascii="Times New Roman" w:hAnsi="Times New Roman" w:cs="Times New Roman" w:eastAsia="Times New Roman"/>
         </w:rPr>
@@ -450,6 +486,8 @@
       <w:r>
         <w:rPr>
           <w:rFonts w:ascii="Times New Roman" w:hAnsi="Times New Roman"/>
+          <w:b w:val="0"/>
+          <w:i w:val="0"/>
           <w:sz w:val="24"/>
           <w:rFonts w:ascii="Times New Roman" w:hAnsi="Times New Roman" w:cs="Times New Roman" w:eastAsia="Times New Roman"/>
         </w:rPr>
@@ -465,6 +503,8 @@
       <w:r>
         <w:rPr>
           <w:rFonts w:ascii="Times New Roman" w:hAnsi="Times New Roman"/>
+          <w:b w:val="0"/>
+          <w:i w:val="0"/>
           <w:sz w:val="24"/>
           <w:rFonts w:ascii="Times New Roman" w:hAnsi="Times New Roman" w:cs="Times New Roman" w:eastAsia="Times New Roman"/>
         </w:rPr>
@@ -494,6 +534,8 @@
       <w:r>
         <w:rPr>
           <w:rFonts w:ascii="Times New Roman" w:hAnsi="Times New Roman"/>
+          <w:b w:val="0"/>
+          <w:i w:val="0"/>
           <w:sz w:val="24"/>
           <w:rFonts w:ascii="Times New Roman" w:hAnsi="Times New Roman" w:cs="Times New Roman" w:eastAsia="Times New Roman"/>
         </w:rPr>
@@ -528,6 +570,7 @@
         <w:rPr>
           <w:rFonts w:ascii="Times New Roman" w:hAnsi="Times New Roman"/>
           <w:b/>
+          <w:i w:val="0"/>
           <w:sz w:val="24"/>
           <w:rFonts w:ascii="Times New Roman" w:hAnsi="Times New Roman" w:cs="Times New Roman" w:eastAsia="Times New Roman"/>
         </w:rPr>
@@ -536,6 +579,8 @@
       <w:r>
         <w:rPr>
           <w:rFonts w:ascii="Times New Roman" w:hAnsi="Times New Roman"/>
+          <w:b w:val="0"/>
+          <w:i w:val="0"/>
           <w:sz w:val="24"/>
           <w:rFonts w:ascii="Times New Roman" w:hAnsi="Times New Roman" w:cs="Times New Roman" w:eastAsia="Times New Roman"/>
         </w:rPr>
@@ -551,6 +596,8 @@
       <w:r>
         <w:rPr>
           <w:rFonts w:ascii="Times New Roman" w:hAnsi="Times New Roman"/>
+          <w:b w:val="0"/>
+          <w:i w:val="0"/>
           <w:sz w:val="24"/>
           <w:rFonts w:ascii="Times New Roman" w:hAnsi="Times New Roman" w:cs="Times New Roman" w:eastAsia="Times New Roman"/>
         </w:rPr>
@@ -566,6 +613,8 @@
       <w:r>
         <w:rPr>
           <w:rFonts w:ascii="Times New Roman" w:hAnsi="Times New Roman"/>
+          <w:b w:val="0"/>
+          <w:i w:val="0"/>
           <w:sz w:val="24"/>
           <w:rFonts w:ascii="Times New Roman" w:hAnsi="Times New Roman" w:cs="Times New Roman" w:eastAsia="Times New Roman"/>
         </w:rPr>
@@ -618,6 +667,7 @@
         <w:rPr>
           <w:rFonts w:ascii="Times New Roman" w:hAnsi="Times New Roman"/>
           <w:b/>
+          <w:i w:val="0"/>
           <w:sz w:val="24"/>
           <w:rFonts w:ascii="Times New Roman" w:hAnsi="Times New Roman" w:cs="Times New Roman" w:eastAsia="Times New Roman"/>
         </w:rPr>
@@ -626,6 +676,8 @@
       <w:r>
         <w:rPr>
           <w:rFonts w:ascii="Times New Roman" w:hAnsi="Times New Roman"/>
+          <w:b w:val="0"/>
+          <w:i w:val="0"/>
           <w:sz w:val="24"/>
           <w:rFonts w:ascii="Times New Roman" w:hAnsi="Times New Roman" w:cs="Times New Roman" w:eastAsia="Times New Roman"/>
         </w:rPr>
@@ -641,6 +693,8 @@
       <w:r>
         <w:rPr>
           <w:rFonts w:ascii="Times New Roman" w:hAnsi="Times New Roman"/>
+          <w:b w:val="0"/>
+          <w:i w:val="0"/>
           <w:sz w:val="24"/>
           <w:rFonts w:ascii="Times New Roman" w:hAnsi="Times New Roman" w:cs="Times New Roman" w:eastAsia="Times New Roman"/>
         </w:rPr>
@@ -670,6 +724,8 @@
       <w:r>
         <w:rPr>
           <w:rFonts w:ascii="Times New Roman" w:hAnsi="Times New Roman"/>
+          <w:b w:val="0"/>
+          <w:i w:val="0"/>
           <w:sz w:val="24"/>
           <w:rFonts w:ascii="Times New Roman" w:hAnsi="Times New Roman" w:cs="Times New Roman" w:eastAsia="Times New Roman"/>
         </w:rPr>
@@ -685,6 +741,8 @@
       <w:r>
         <w:rPr>
           <w:rFonts w:ascii="Times New Roman" w:hAnsi="Times New Roman"/>
+          <w:b w:val="0"/>
+          <w:i w:val="0"/>
           <w:sz w:val="24"/>
           <w:rFonts w:ascii="Times New Roman" w:hAnsi="Times New Roman" w:cs="Times New Roman" w:eastAsia="Times New Roman"/>
         </w:rPr>
@@ -719,6 +777,7 @@
         <w:rPr>
           <w:rFonts w:ascii="Times New Roman" w:hAnsi="Times New Roman"/>
           <w:b/>
+          <w:i w:val="0"/>
           <w:sz w:val="24"/>
           <w:rFonts w:ascii="Times New Roman" w:hAnsi="Times New Roman" w:cs="Times New Roman" w:eastAsia="Times New Roman"/>
         </w:rPr>
@@ -727,6 +786,8 @@
       <w:r>
         <w:rPr>
           <w:rFonts w:ascii="Times New Roman" w:hAnsi="Times New Roman"/>
+          <w:b w:val="0"/>
+          <w:i w:val="0"/>
           <w:sz w:val="24"/>
           <w:rFonts w:ascii="Times New Roman" w:hAnsi="Times New Roman" w:cs="Times New Roman" w:eastAsia="Times New Roman"/>
         </w:rPr>
@@ -742,6 +803,8 @@
       <w:r>
         <w:rPr>
           <w:rFonts w:ascii="Times New Roman" w:hAnsi="Times New Roman"/>
+          <w:b w:val="0"/>
+          <w:i w:val="0"/>
           <w:sz w:val="24"/>
           <w:rFonts w:ascii="Times New Roman" w:hAnsi="Times New Roman" w:cs="Times New Roman" w:eastAsia="Times New Roman"/>
         </w:rPr>
@@ -757,6 +820,8 @@
       <w:r>
         <w:rPr>
           <w:rFonts w:ascii="Times New Roman" w:hAnsi="Times New Roman"/>
+          <w:b w:val="0"/>
+          <w:i w:val="0"/>
           <w:sz w:val="24"/>
           <w:rFonts w:ascii="Times New Roman" w:hAnsi="Times New Roman" w:cs="Times New Roman" w:eastAsia="Times New Roman"/>
         </w:rPr>
@@ -791,6 +856,7 @@
         <w:rPr>
           <w:rFonts w:ascii="Times New Roman" w:hAnsi="Times New Roman"/>
           <w:b/>
+          <w:i w:val="0"/>
           <w:sz w:val="24"/>
           <w:rFonts w:ascii="Times New Roman" w:hAnsi="Times New Roman" w:cs="Times New Roman" w:eastAsia="Times New Roman"/>
         </w:rPr>
@@ -799,6 +865,8 @@
       <w:r>
         <w:rPr>
           <w:rFonts w:ascii="Times New Roman" w:hAnsi="Times New Roman"/>
+          <w:b w:val="0"/>
+          <w:i w:val="0"/>
           <w:sz w:val="24"/>
           <w:rFonts w:ascii="Times New Roman" w:hAnsi="Times New Roman" w:cs="Times New Roman" w:eastAsia="Times New Roman"/>
         </w:rPr>
@@ -814,6 +882,8 @@
       <w:r>
         <w:rPr>
           <w:rFonts w:ascii="Times New Roman" w:hAnsi="Times New Roman"/>
+          <w:b w:val="0"/>
+          <w:i w:val="0"/>
           <w:sz w:val="24"/>
           <w:rFonts w:ascii="Times New Roman" w:hAnsi="Times New Roman" w:cs="Times New Roman" w:eastAsia="Times New Roman"/>
         </w:rPr>
@@ -857,6 +927,7 @@
               <w:rPr>
                 <w:rFonts w:ascii="Times New Roman" w:hAnsi="Times New Roman"/>
                 <w:b/>
+                <w:i w:val="0"/>
                 <w:sz w:val="22"/>
                 <w:rFonts w:ascii="Times New Roman" w:hAnsi="Times New Roman" w:cs="Times New Roman" w:eastAsia="Times New Roman"/>
               </w:rPr>
@@ -889,6 +960,7 @@
               <w:rPr>
                 <w:rFonts w:ascii="Times New Roman" w:hAnsi="Times New Roman"/>
                 <w:b/>
+                <w:i w:val="0"/>
                 <w:sz w:val="22"/>
                 <w:rFonts w:ascii="Times New Roman" w:hAnsi="Times New Roman" w:cs="Times New Roman" w:eastAsia="Times New Roman"/>
               </w:rPr>
@@ -921,6 +993,7 @@
               <w:rPr>
                 <w:rFonts w:ascii="Times New Roman" w:hAnsi="Times New Roman"/>
                 <w:b/>
+                <w:i w:val="0"/>
                 <w:sz w:val="22"/>
                 <w:rFonts w:ascii="Times New Roman" w:hAnsi="Times New Roman" w:cs="Times New Roman" w:eastAsia="Times New Roman"/>
               </w:rPr>
@@ -950,6 +1023,8 @@
             <w:r>
               <w:rPr>
                 <w:rFonts w:ascii="Times New Roman" w:hAnsi="Times New Roman"/>
+                <w:b w:val="0"/>
+                <w:i w:val="0"/>
                 <w:sz w:val="21"/>
                 <w:rFonts w:ascii="Times New Roman" w:hAnsi="Times New Roman" w:cs="Times New Roman" w:eastAsia="Times New Roman"/>
               </w:rPr>
@@ -977,6 +1052,8 @@
             <w:r>
               <w:rPr>
                 <w:rFonts w:ascii="Times New Roman" w:hAnsi="Times New Roman"/>
+                <w:b w:val="0"/>
+                <w:i w:val="0"/>
                 <w:sz w:val="21"/>
                 <w:rFonts w:ascii="Times New Roman" w:hAnsi="Times New Roman" w:cs="Times New Roman" w:eastAsia="Times New Roman"/>
               </w:rPr>
@@ -1004,6 +1081,8 @@
             <w:r>
               <w:rPr>
                 <w:rFonts w:ascii="Times New Roman" w:hAnsi="Times New Roman"/>
+                <w:b w:val="0"/>
+                <w:i w:val="0"/>
                 <w:sz w:val="21"/>
                 <w:rFonts w:ascii="Times New Roman" w:hAnsi="Times New Roman" w:cs="Times New Roman" w:eastAsia="Times New Roman"/>
               </w:rPr>
@@ -1033,6 +1112,8 @@
             <w:r>
               <w:rPr>
                 <w:rFonts w:ascii="Times New Roman" w:hAnsi="Times New Roman"/>
+                <w:b w:val="0"/>
+                <w:i w:val="0"/>
                 <w:sz w:val="21"/>
                 <w:rFonts w:ascii="Times New Roman" w:hAnsi="Times New Roman" w:cs="Times New Roman" w:eastAsia="Times New Roman"/>
               </w:rPr>
@@ -1060,6 +1141,8 @@
             <w:r>
               <w:rPr>
                 <w:rFonts w:ascii="Times New Roman" w:hAnsi="Times New Roman"/>
+                <w:b w:val="0"/>
+                <w:i w:val="0"/>
                 <w:sz w:val="21"/>
                 <w:rFonts w:ascii="Times New Roman" w:hAnsi="Times New Roman" w:cs="Times New Roman" w:eastAsia="Times New Roman"/>
               </w:rPr>
@@ -1087,6 +1170,8 @@
             <w:r>
               <w:rPr>
                 <w:rFonts w:ascii="Times New Roman" w:hAnsi="Times New Roman"/>
+                <w:b w:val="0"/>
+                <w:i w:val="0"/>
                 <w:sz w:val="21"/>
                 <w:rFonts w:ascii="Times New Roman" w:hAnsi="Times New Roman" w:cs="Times New Roman" w:eastAsia="Times New Roman"/>
               </w:rPr>
@@ -1116,6 +1201,8 @@
             <w:r>
               <w:rPr>
                 <w:rFonts w:ascii="Times New Roman" w:hAnsi="Times New Roman"/>
+                <w:b w:val="0"/>
+                <w:i w:val="0"/>
                 <w:sz w:val="21"/>
                 <w:rFonts w:ascii="Times New Roman" w:hAnsi="Times New Roman" w:cs="Times New Roman" w:eastAsia="Times New Roman"/>
               </w:rPr>
@@ -1143,6 +1230,8 @@
             <w:r>
               <w:rPr>
                 <w:rFonts w:ascii="Times New Roman" w:hAnsi="Times New Roman"/>
+                <w:b w:val="0"/>
+                <w:i w:val="0"/>
                 <w:sz w:val="21"/>
                 <w:rFonts w:ascii="Times New Roman" w:hAnsi="Times New Roman" w:cs="Times New Roman" w:eastAsia="Times New Roman"/>
               </w:rPr>
@@ -1170,6 +1259,8 @@
             <w:r>
               <w:rPr>
                 <w:rFonts w:ascii="Times New Roman" w:hAnsi="Times New Roman"/>
+                <w:b w:val="0"/>
+                <w:i w:val="0"/>
                 <w:sz w:val="21"/>
                 <w:rFonts w:ascii="Times New Roman" w:hAnsi="Times New Roman" w:cs="Times New Roman" w:eastAsia="Times New Roman"/>
               </w:rPr>
@@ -1188,6 +1279,8 @@
       <w:r>
         <w:rPr>
           <w:rFonts w:ascii="Times New Roman" w:hAnsi="Times New Roman"/>
+          <w:b w:val="0"/>
+          <w:i w:val="0"/>
           <w:sz w:val="24"/>
           <w:rFonts w:ascii="Times New Roman" w:hAnsi="Times New Roman" w:cs="Times New Roman" w:eastAsia="Times New Roman"/>
         </w:rPr>
@@ -1203,6 +1296,8 @@
       <w:r>
         <w:rPr>
           <w:rFonts w:ascii="Times New Roman" w:hAnsi="Times New Roman"/>
+          <w:b w:val="0"/>
+          <w:i w:val="0"/>
           <w:sz w:val="24"/>
           <w:rFonts w:ascii="Times New Roman" w:hAnsi="Times New Roman" w:cs="Times New Roman" w:eastAsia="Times New Roman"/>
         </w:rPr>
@@ -1237,6 +1332,7 @@
         <w:rPr>
           <w:rFonts w:ascii="Times New Roman" w:hAnsi="Times New Roman"/>
           <w:b/>
+          <w:i w:val="0"/>
           <w:sz w:val="24"/>
           <w:rFonts w:ascii="Times New Roman" w:hAnsi="Times New Roman" w:cs="Times New Roman" w:eastAsia="Times New Roman"/>
         </w:rPr>
@@ -1245,6 +1341,8 @@
       <w:r>
         <w:rPr>
           <w:rFonts w:ascii="Times New Roman" w:hAnsi="Times New Roman"/>
+          <w:b w:val="0"/>
+          <w:i w:val="0"/>
           <w:sz w:val="24"/>
           <w:rFonts w:ascii="Times New Roman" w:hAnsi="Times New Roman" w:cs="Times New Roman" w:eastAsia="Times New Roman"/>
         </w:rPr>
@@ -1260,6 +1358,8 @@
       <w:r>
         <w:rPr>
           <w:rFonts w:ascii="Times New Roman" w:hAnsi="Times New Roman"/>
+          <w:b w:val="0"/>
+          <w:i w:val="0"/>
           <w:sz w:val="24"/>
           <w:rFonts w:ascii="Times New Roman" w:hAnsi="Times New Roman" w:cs="Times New Roman" w:eastAsia="Times New Roman"/>
         </w:rPr>
@@ -1317,6 +1417,8 @@
       <w:r>
         <w:rPr>
           <w:rFonts w:ascii="Times New Roman" w:hAnsi="Times New Roman"/>
+          <w:b w:val="0"/>
+          <w:i w:val="0"/>
           <w:sz w:val="24"/>
           <w:rFonts w:ascii="Times New Roman" w:hAnsi="Times New Roman" w:cs="Times New Roman" w:eastAsia="Times New Roman"/>
         </w:rPr>
@@ -1416,6 +1518,8 @@
       <w:r>
         <w:rPr>
           <w:rFonts w:ascii="Times New Roman" w:hAnsi="Times New Roman"/>
+          <w:b w:val="0"/>
+          <w:i w:val="0"/>
           <w:sz w:val="24"/>
           <w:rFonts w:ascii="Times New Roman" w:hAnsi="Times New Roman" w:cs="Times New Roman" w:eastAsia="Times New Roman"/>
         </w:rPr>
@@ -1431,6 +1535,8 @@
       <w:r>
         <w:rPr>
           <w:rFonts w:ascii="Times New Roman" w:hAnsi="Times New Roman"/>
+          <w:b w:val="0"/>
+          <w:i w:val="0"/>
           <w:sz w:val="24"/>
           <w:rFonts w:ascii="Times New Roman" w:hAnsi="Times New Roman" w:cs="Times New Roman" w:eastAsia="Times New Roman"/>
         </w:rPr>
@@ -1475,6 +1581,7 @@
               <w:rPr>
                 <w:rFonts w:ascii="Times New Roman" w:hAnsi="Times New Roman"/>
                 <w:b/>
+                <w:i w:val="0"/>
                 <w:sz w:val="22"/>
                 <w:rFonts w:ascii="Times New Roman" w:hAnsi="Times New Roman" w:cs="Times New Roman" w:eastAsia="Times New Roman"/>
               </w:rPr>
@@ -1507,6 +1614,7 @@
               <w:rPr>
                 <w:rFonts w:ascii="Times New Roman" w:hAnsi="Times New Roman"/>
                 <w:b/>
+                <w:i w:val="0"/>
                 <w:sz w:val="22"/>
                 <w:rFonts w:ascii="Times New Roman" w:hAnsi="Times New Roman" w:cs="Times New Roman" w:eastAsia="Times New Roman"/>
               </w:rPr>
@@ -1539,6 +1647,7 @@
               <w:rPr>
                 <w:rFonts w:ascii="Times New Roman" w:hAnsi="Times New Roman"/>
                 <w:b/>
+                <w:i w:val="0"/>
                 <w:sz w:val="22"/>
                 <w:rFonts w:ascii="Times New Roman" w:hAnsi="Times New Roman" w:cs="Times New Roman" w:eastAsia="Times New Roman"/>
               </w:rPr>
@@ -1571,6 +1680,7 @@
               <w:rPr>
                 <w:rFonts w:ascii="Times New Roman" w:hAnsi="Times New Roman"/>
                 <w:b/>
+                <w:i w:val="0"/>
                 <w:sz w:val="22"/>
                 <w:rFonts w:ascii="Times New Roman" w:hAnsi="Times New Roman" w:cs="Times New Roman" w:eastAsia="Times New Roman"/>
               </w:rPr>
@@ -1600,6 +1710,8 @@
             <w:r>
               <w:rPr>
                 <w:rFonts w:ascii="Times New Roman" w:hAnsi="Times New Roman"/>
+                <w:b w:val="0"/>
+                <w:i w:val="0"/>
                 <w:sz w:val="21"/>
                 <w:rFonts w:ascii="Times New Roman" w:hAnsi="Times New Roman" w:cs="Times New Roman" w:eastAsia="Times New Roman"/>
               </w:rPr>
@@ -1627,6 +1739,8 @@
             <w:r>
               <w:rPr>
                 <w:rFonts w:ascii="Times New Roman" w:hAnsi="Times New Roman"/>
+                <w:b w:val="0"/>
+                <w:i w:val="0"/>
                 <w:sz w:val="21"/>
                 <w:rFonts w:ascii="Times New Roman" w:hAnsi="Times New Roman" w:cs="Times New Roman" w:eastAsia="Times New Roman"/>
               </w:rPr>
@@ -1654,6 +1768,8 @@
             <w:r>
               <w:rPr>
                 <w:rFonts w:ascii="Times New Roman" w:hAnsi="Times New Roman"/>
+                <w:b w:val="0"/>
+                <w:i w:val="0"/>
                 <w:sz w:val="21"/>
                 <w:rFonts w:ascii="Times New Roman" w:hAnsi="Times New Roman" w:cs="Times New Roman" w:eastAsia="Times New Roman"/>
               </w:rPr>
@@ -1681,6 +1797,8 @@
             <w:r>
               <w:rPr>
                 <w:rFonts w:ascii="Times New Roman" w:hAnsi="Times New Roman"/>
+                <w:b w:val="0"/>
+                <w:i w:val="0"/>
                 <w:sz w:val="21"/>
                 <w:rFonts w:ascii="Times New Roman" w:hAnsi="Times New Roman" w:cs="Times New Roman" w:eastAsia="Times New Roman"/>
               </w:rPr>
@@ -1710,6 +1828,8 @@
             <w:r>
               <w:rPr>
                 <w:rFonts w:ascii="Times New Roman" w:hAnsi="Times New Roman"/>
+                <w:b w:val="0"/>
+                <w:i w:val="0"/>
                 <w:sz w:val="21"/>
                 <w:rFonts w:ascii="Times New Roman" w:hAnsi="Times New Roman" w:cs="Times New Roman" w:eastAsia="Times New Roman"/>
               </w:rPr>
@@ -1737,6 +1857,8 @@
             <w:r>
               <w:rPr>
                 <w:rFonts w:ascii="Times New Roman" w:hAnsi="Times New Roman"/>
+                <w:b w:val="0"/>
+                <w:i w:val="0"/>
                 <w:sz w:val="21"/>
                 <w:rFonts w:ascii="Times New Roman" w:hAnsi="Times New Roman" w:cs="Times New Roman" w:eastAsia="Times New Roman"/>
               </w:rPr>
@@ -1764,6 +1886,8 @@
             <w:r>
               <w:rPr>
                 <w:rFonts w:ascii="Times New Roman" w:hAnsi="Times New Roman"/>
+                <w:b w:val="0"/>
+                <w:i w:val="0"/>
                 <w:sz w:val="21"/>
                 <w:rFonts w:ascii="Times New Roman" w:hAnsi="Times New Roman" w:cs="Times New Roman" w:eastAsia="Times New Roman"/>
               </w:rPr>
@@ -1791,6 +1915,8 @@
             <w:r>
               <w:rPr>
                 <w:rFonts w:ascii="Times New Roman" w:hAnsi="Times New Roman"/>
+                <w:b w:val="0"/>
+                <w:i w:val="0"/>
                 <w:sz w:val="21"/>
                 <w:rFonts w:ascii="Times New Roman" w:hAnsi="Times New Roman" w:cs="Times New Roman" w:eastAsia="Times New Roman"/>
               </w:rPr>
@@ -1820,6 +1946,8 @@
             <w:r>
               <w:rPr>
                 <w:rFonts w:ascii="Times New Roman" w:hAnsi="Times New Roman"/>
+                <w:b w:val="0"/>
+                <w:i w:val="0"/>
                 <w:sz w:val="21"/>
                 <w:rFonts w:ascii="Times New Roman" w:hAnsi="Times New Roman" w:cs="Times New Roman" w:eastAsia="Times New Roman"/>
               </w:rPr>
@@ -1847,6 +1975,8 @@
             <w:r>
               <w:rPr>
                 <w:rFonts w:ascii="Times New Roman" w:hAnsi="Times New Roman"/>
+                <w:b w:val="0"/>
+                <w:i w:val="0"/>
                 <w:sz w:val="21"/>
                 <w:rFonts w:ascii="Times New Roman" w:hAnsi="Times New Roman" w:cs="Times New Roman" w:eastAsia="Times New Roman"/>
               </w:rPr>
@@ -1874,6 +2004,8 @@
             <w:r>
               <w:rPr>
                 <w:rFonts w:ascii="Times New Roman" w:hAnsi="Times New Roman"/>
+                <w:b w:val="0"/>
+                <w:i w:val="0"/>
                 <w:sz w:val="21"/>
                 <w:rFonts w:ascii="Times New Roman" w:hAnsi="Times New Roman" w:cs="Times New Roman" w:eastAsia="Times New Roman"/>
               </w:rPr>
@@ -1901,6 +2033,8 @@
             <w:r>
               <w:rPr>
                 <w:rFonts w:ascii="Times New Roman" w:hAnsi="Times New Roman"/>
+                <w:b w:val="0"/>
+                <w:i w:val="0"/>
                 <w:sz w:val="21"/>
                 <w:rFonts w:ascii="Times New Roman" w:hAnsi="Times New Roman" w:cs="Times New Roman" w:eastAsia="Times New Roman"/>
               </w:rPr>
@@ -1919,6 +2053,8 @@
       <w:r>
         <w:rPr>
           <w:rFonts w:ascii="Times New Roman" w:hAnsi="Times New Roman"/>
+          <w:b w:val="0"/>
+          <w:i w:val="0"/>
           <w:sz w:val="24"/>
           <w:rFonts w:ascii="Times New Roman" w:hAnsi="Times New Roman" w:cs="Times New Roman" w:eastAsia="Times New Roman"/>
         </w:rPr>
@@ -1953,6 +2089,7 @@
         <w:rPr>
           <w:rFonts w:ascii="Times New Roman" w:hAnsi="Times New Roman"/>
           <w:b/>
+          <w:i w:val="0"/>
           <w:sz w:val="24"/>
           <w:rFonts w:ascii="Times New Roman" w:hAnsi="Times New Roman" w:cs="Times New Roman" w:eastAsia="Times New Roman"/>
         </w:rPr>
@@ -1961,6 +2098,8 @@
       <w:r>
         <w:rPr>
           <w:rFonts w:ascii="Times New Roman" w:hAnsi="Times New Roman"/>
+          <w:b w:val="0"/>
+          <w:i w:val="0"/>
           <w:sz w:val="24"/>
           <w:rFonts w:ascii="Times New Roman" w:hAnsi="Times New Roman" w:cs="Times New Roman" w:eastAsia="Times New Roman"/>
         </w:rPr>
@@ -1990,6 +2129,8 @@
       <w:r>
         <w:rPr>
           <w:rFonts w:ascii="Times New Roman" w:hAnsi="Times New Roman"/>
+          <w:b w:val="0"/>
+          <w:i w:val="0"/>
           <w:sz w:val="24"/>
           <w:rFonts w:ascii="Times New Roman" w:hAnsi="Times New Roman" w:cs="Times New Roman" w:eastAsia="Times New Roman"/>
         </w:rPr>
@@ -2013,6 +2154,8 @@
       <w:r>
         <w:rPr>
           <w:rFonts w:ascii="Times New Roman" w:hAnsi="Times New Roman"/>
+          <w:b w:val="0"/>
+          <w:i w:val="0"/>
           <w:sz w:val="24"/>
           <w:rFonts w:ascii="Times New Roman" w:hAnsi="Times New Roman" w:cs="Times New Roman" w:eastAsia="Times New Roman"/>
         </w:rPr>
@@ -2036,6 +2179,8 @@
       <w:r>
         <w:rPr>
           <w:rFonts w:ascii="Times New Roman" w:hAnsi="Times New Roman"/>
+          <w:b w:val="0"/>
+          <w:i w:val="0"/>
           <w:sz w:val="24"/>
           <w:rFonts w:ascii="Times New Roman" w:hAnsi="Times New Roman" w:cs="Times New Roman" w:eastAsia="Times New Roman"/>
         </w:rPr>
@@ -2059,6 +2204,8 @@
       <w:r>
         <w:rPr>
           <w:rFonts w:ascii="Times New Roman" w:hAnsi="Times New Roman"/>
+          <w:b w:val="0"/>
+          <w:i w:val="0"/>
           <w:sz w:val="24"/>
           <w:rFonts w:ascii="Times New Roman" w:hAnsi="Times New Roman" w:cs="Times New Roman" w:eastAsia="Times New Roman"/>
         </w:rPr>
@@ -2082,6 +2229,8 @@
       <w:r>
         <w:rPr>
           <w:rFonts w:ascii="Times New Roman" w:hAnsi="Times New Roman"/>
+          <w:b w:val="0"/>
+          <w:i w:val="0"/>
           <w:sz w:val="24"/>
           <w:rFonts w:ascii="Times New Roman" w:hAnsi="Times New Roman" w:cs="Times New Roman" w:eastAsia="Times New Roman"/>
         </w:rPr>
@@ -2105,6 +2254,8 @@
       <w:r>
         <w:rPr>
           <w:rFonts w:ascii="Times New Roman" w:hAnsi="Times New Roman"/>
+          <w:b w:val="0"/>
+          <w:i w:val="0"/>
           <w:sz w:val="24"/>
           <w:rFonts w:ascii="Times New Roman" w:hAnsi="Times New Roman" w:cs="Times New Roman" w:eastAsia="Times New Roman"/>
         </w:rPr>
@@ -2128,6 +2279,8 @@
       <w:r>
         <w:rPr>
           <w:rFonts w:ascii="Times New Roman" w:hAnsi="Times New Roman"/>
+          <w:b w:val="0"/>
+          <w:i w:val="0"/>
           <w:sz w:val="24"/>
           <w:rFonts w:ascii="Times New Roman" w:hAnsi="Times New Roman" w:cs="Times New Roman" w:eastAsia="Times New Roman"/>
         </w:rPr>
@@ -2143,6 +2296,8 @@
       <w:r>
         <w:rPr>
           <w:rFonts w:ascii="Times New Roman" w:hAnsi="Times New Roman"/>
+          <w:b w:val="0"/>
+          <w:i w:val="0"/>
           <w:sz w:val="24"/>
           <w:rFonts w:ascii="Times New Roman" w:hAnsi="Times New Roman" w:cs="Times New Roman" w:eastAsia="Times New Roman"/>
         </w:rPr>
@@ -2195,6 +2350,7 @@
         <w:rPr>
           <w:rFonts w:ascii="Times New Roman" w:hAnsi="Times New Roman"/>
           <w:b/>
+          <w:i w:val="0"/>
           <w:sz w:val="24"/>
           <w:rFonts w:ascii="Times New Roman" w:hAnsi="Times New Roman" w:cs="Times New Roman" w:eastAsia="Times New Roman"/>
         </w:rPr>
@@ -2203,6 +2359,8 @@
       <w:r>
         <w:rPr>
           <w:rFonts w:ascii="Times New Roman" w:hAnsi="Times New Roman"/>
+          <w:b w:val="0"/>
+          <w:i w:val="0"/>
           <w:sz w:val="24"/>
           <w:rFonts w:ascii="Times New Roman" w:hAnsi="Times New Roman" w:cs="Times New Roman" w:eastAsia="Times New Roman"/>
         </w:rPr>
@@ -2246,6 +2404,7 @@
               <w:rPr>
                 <w:rFonts w:ascii="Times New Roman" w:hAnsi="Times New Roman"/>
                 <w:b/>
+                <w:i w:val="0"/>
                 <w:sz w:val="22"/>
                 <w:rFonts w:ascii="Times New Roman" w:hAnsi="Times New Roman" w:cs="Times New Roman" w:eastAsia="Times New Roman"/>
               </w:rPr>
@@ -2278,6 +2437,7 @@
               <w:rPr>
                 <w:rFonts w:ascii="Times New Roman" w:hAnsi="Times New Roman"/>
                 <w:b/>
+                <w:i w:val="0"/>
                 <w:sz w:val="22"/>
                 <w:rFonts w:ascii="Times New Roman" w:hAnsi="Times New Roman" w:cs="Times New Roman" w:eastAsia="Times New Roman"/>
               </w:rPr>
@@ -2310,6 +2470,7 @@
               <w:rPr>
                 <w:rFonts w:ascii="Times New Roman" w:hAnsi="Times New Roman"/>
                 <w:b/>
+                <w:i w:val="0"/>
                 <w:sz w:val="22"/>
                 <w:rFonts w:ascii="Times New Roman" w:hAnsi="Times New Roman" w:cs="Times New Roman" w:eastAsia="Times New Roman"/>
               </w:rPr>
@@ -2339,6 +2500,8 @@
             <w:r>
               <w:rPr>
                 <w:rFonts w:ascii="Times New Roman" w:hAnsi="Times New Roman"/>
+                <w:b w:val="0"/>
+                <w:i w:val="0"/>
                 <w:sz w:val="21"/>
                 <w:rFonts w:ascii="Times New Roman" w:hAnsi="Times New Roman" w:cs="Times New Roman" w:eastAsia="Times New Roman"/>
               </w:rPr>
@@ -2366,6 +2529,8 @@
             <w:r>
               <w:rPr>
                 <w:rFonts w:ascii="Times New Roman" w:hAnsi="Times New Roman"/>
+                <w:b w:val="0"/>
+                <w:i w:val="0"/>
                 <w:sz w:val="21"/>
                 <w:rFonts w:ascii="Times New Roman" w:hAnsi="Times New Roman" w:cs="Times New Roman" w:eastAsia="Times New Roman"/>
               </w:rPr>
@@ -2393,6 +2558,8 @@
             <w:r>
               <w:rPr>
                 <w:rFonts w:ascii="Times New Roman" w:hAnsi="Times New Roman"/>
+                <w:b w:val="0"/>
+                <w:i w:val="0"/>
                 <w:sz w:val="21"/>
                 <w:rFonts w:ascii="Times New Roman" w:hAnsi="Times New Roman" w:cs="Times New Roman" w:eastAsia="Times New Roman"/>
               </w:rPr>
@@ -2422,6 +2589,8 @@
             <w:r>
               <w:rPr>
                 <w:rFonts w:ascii="Times New Roman" w:hAnsi="Times New Roman"/>
+                <w:b w:val="0"/>
+                <w:i w:val="0"/>
                 <w:sz w:val="21"/>
                 <w:rFonts w:ascii="Times New Roman" w:hAnsi="Times New Roman" w:cs="Times New Roman" w:eastAsia="Times New Roman"/>
               </w:rPr>
@@ -2449,6 +2618,8 @@
             <w:r>
               <w:rPr>
                 <w:rFonts w:ascii="Times New Roman" w:hAnsi="Times New Roman"/>
+                <w:b w:val="0"/>
+                <w:i w:val="0"/>
                 <w:sz w:val="21"/>
                 <w:rFonts w:ascii="Times New Roman" w:hAnsi="Times New Roman" w:cs="Times New Roman" w:eastAsia="Times New Roman"/>
               </w:rPr>
@@ -2476,6 +2647,8 @@
             <w:r>
               <w:rPr>
                 <w:rFonts w:ascii="Times New Roman" w:hAnsi="Times New Roman"/>
+                <w:b w:val="0"/>
+                <w:i w:val="0"/>
                 <w:sz w:val="21"/>
                 <w:rFonts w:ascii="Times New Roman" w:hAnsi="Times New Roman" w:cs="Times New Roman" w:eastAsia="Times New Roman"/>
               </w:rPr>
@@ -2505,6 +2678,8 @@
             <w:r>
               <w:rPr>
                 <w:rFonts w:ascii="Times New Roman" w:hAnsi="Times New Roman"/>
+                <w:b w:val="0"/>
+                <w:i w:val="0"/>
                 <w:sz w:val="21"/>
                 <w:rFonts w:ascii="Times New Roman" w:hAnsi="Times New Roman" w:cs="Times New Roman" w:eastAsia="Times New Roman"/>
               </w:rPr>
@@ -2532,6 +2707,8 @@
             <w:r>
               <w:rPr>
                 <w:rFonts w:ascii="Times New Roman" w:hAnsi="Times New Roman"/>
+                <w:b w:val="0"/>
+                <w:i w:val="0"/>
                 <w:sz w:val="21"/>
                 <w:rFonts w:ascii="Times New Roman" w:hAnsi="Times New Roman" w:cs="Times New Roman" w:eastAsia="Times New Roman"/>
               </w:rPr>
@@ -2559,6 +2736,8 @@
             <w:r>
               <w:rPr>
                 <w:rFonts w:ascii="Times New Roman" w:hAnsi="Times New Roman"/>
+                <w:b w:val="0"/>
+                <w:i w:val="0"/>
                 <w:sz w:val="21"/>
                 <w:rFonts w:ascii="Times New Roman" w:hAnsi="Times New Roman" w:cs="Times New Roman" w:eastAsia="Times New Roman"/>
               </w:rPr>
@@ -2588,6 +2767,8 @@
             <w:r>
               <w:rPr>
                 <w:rFonts w:ascii="Times New Roman" w:hAnsi="Times New Roman"/>
+                <w:b w:val="0"/>
+                <w:i w:val="0"/>
                 <w:sz w:val="21"/>
                 <w:rFonts w:ascii="Times New Roman" w:hAnsi="Times New Roman" w:cs="Times New Roman" w:eastAsia="Times New Roman"/>
               </w:rPr>
@@ -2615,6 +2796,8 @@
             <w:r>
               <w:rPr>
                 <w:rFonts w:ascii="Times New Roman" w:hAnsi="Times New Roman"/>
+                <w:b w:val="0"/>
+                <w:i w:val="0"/>
                 <w:sz w:val="21"/>
                 <w:rFonts w:ascii="Times New Roman" w:hAnsi="Times New Roman" w:cs="Times New Roman" w:eastAsia="Times New Roman"/>
               </w:rPr>
@@ -2642,6 +2825,8 @@
             <w:r>
               <w:rPr>
                 <w:rFonts w:ascii="Times New Roman" w:hAnsi="Times New Roman"/>
+                <w:b w:val="0"/>
+                <w:i w:val="0"/>
                 <w:sz w:val="21"/>
                 <w:rFonts w:ascii="Times New Roman" w:hAnsi="Times New Roman" w:cs="Times New Roman" w:eastAsia="Times New Roman"/>
               </w:rPr>
@@ -2660,6 +2845,8 @@
       <w:r>
         <w:rPr>
           <w:rFonts w:ascii="Times New Roman" w:hAnsi="Times New Roman"/>
+          <w:b w:val="0"/>
+          <w:i w:val="0"/>
           <w:sz w:val="24"/>
           <w:rFonts w:ascii="Times New Roman" w:hAnsi="Times New Roman" w:cs="Times New Roman" w:eastAsia="Times New Roman"/>
         </w:rPr>
@@ -2675,6 +2862,8 @@
       <w:r>
         <w:rPr>
           <w:rFonts w:ascii="Times New Roman" w:hAnsi="Times New Roman"/>
+          <w:b w:val="0"/>
+          <w:i w:val="0"/>
           <w:sz w:val="24"/>
           <w:rFonts w:ascii="Times New Roman" w:hAnsi="Times New Roman" w:cs="Times New Roman" w:eastAsia="Times New Roman"/>
         </w:rPr>
@@ -2709,6 +2898,7 @@
         <w:rPr>
           <w:rFonts w:ascii="Times New Roman" w:hAnsi="Times New Roman"/>
           <w:b/>
+          <w:i w:val="0"/>
           <w:sz w:val="24"/>
           <w:rFonts w:ascii="Times New Roman" w:hAnsi="Times New Roman" w:cs="Times New Roman" w:eastAsia="Times New Roman"/>
         </w:rPr>
@@ -2717,6 +2907,8 @@
       <w:r>
         <w:rPr>
           <w:rFonts w:ascii="Times New Roman" w:hAnsi="Times New Roman"/>
+          <w:b w:val="0"/>
+          <w:i w:val="0"/>
           <w:sz w:val="24"/>
           <w:rFonts w:ascii="Times New Roman" w:hAnsi="Times New Roman" w:cs="Times New Roman" w:eastAsia="Times New Roman"/>
         </w:rPr>
@@ -2740,6 +2932,8 @@
       <w:r>
         <w:rPr>
           <w:rFonts w:ascii="Times New Roman" w:hAnsi="Times New Roman"/>
+          <w:b w:val="0"/>
+          <w:i w:val="0"/>
           <w:sz w:val="24"/>
           <w:rFonts w:ascii="Times New Roman" w:hAnsi="Times New Roman" w:cs="Times New Roman" w:eastAsia="Times New Roman"/>
         </w:rPr>
@@ -2763,6 +2957,8 @@
       <w:r>
         <w:rPr>
           <w:rFonts w:ascii="Times New Roman" w:hAnsi="Times New Roman"/>
+          <w:b w:val="0"/>
+          <w:i w:val="0"/>
           <w:sz w:val="24"/>
           <w:rFonts w:ascii="Times New Roman" w:hAnsi="Times New Roman" w:cs="Times New Roman" w:eastAsia="Times New Roman"/>
         </w:rPr>
@@ -2786,6 +2982,8 @@
       <w:r>
         <w:rPr>
           <w:rFonts w:ascii="Times New Roman" w:hAnsi="Times New Roman"/>
+          <w:b w:val="0"/>
+          <w:i w:val="0"/>
           <w:sz w:val="24"/>
           <w:rFonts w:ascii="Times New Roman" w:hAnsi="Times New Roman" w:cs="Times New Roman" w:eastAsia="Times New Roman"/>
         </w:rPr>
@@ -2809,6 +3007,8 @@
       <w:r>
         <w:rPr>
           <w:rFonts w:ascii="Times New Roman" w:hAnsi="Times New Roman"/>
+          <w:b w:val="0"/>
+          <w:i w:val="0"/>
           <w:sz w:val="24"/>
           <w:rFonts w:ascii="Times New Roman" w:hAnsi="Times New Roman" w:cs="Times New Roman" w:eastAsia="Times New Roman"/>
         </w:rPr>
@@ -2824,6 +3024,8 @@
       <w:r>
         <w:rPr>
           <w:rFonts w:ascii="Times New Roman" w:hAnsi="Times New Roman"/>
+          <w:b w:val="0"/>
+          <w:i w:val="0"/>
           <w:sz w:val="24"/>
           <w:rFonts w:ascii="Times New Roman" w:hAnsi="Times New Roman" w:cs="Times New Roman" w:eastAsia="Times New Roman"/>
         </w:rPr>
@@ -2839,6 +3041,8 @@
       <w:r>
         <w:rPr>
           <w:rFonts w:ascii="Times New Roman" w:hAnsi="Times New Roman"/>
+          <w:b w:val="0"/>
+          <w:i w:val="0"/>
           <w:sz w:val="24"/>
           <w:rFonts w:ascii="Times New Roman" w:hAnsi="Times New Roman" w:cs="Times New Roman" w:eastAsia="Times New Roman"/>
         </w:rPr>
@@ -2873,6 +3077,7 @@
         <w:rPr>
           <w:rFonts w:ascii="Times New Roman" w:hAnsi="Times New Roman"/>
           <w:b/>
+          <w:i w:val="0"/>
           <w:sz w:val="24"/>
           <w:rFonts w:ascii="Times New Roman" w:hAnsi="Times New Roman" w:cs="Times New Roman" w:eastAsia="Times New Roman"/>
         </w:rPr>
@@ -2881,6 +3086,8 @@
       <w:r>
         <w:rPr>
           <w:rFonts w:ascii="Times New Roman" w:hAnsi="Times New Roman"/>
+          <w:b w:val="0"/>
+          <w:i w:val="0"/>
           <w:sz w:val="24"/>
           <w:rFonts w:ascii="Times New Roman" w:hAnsi="Times New Roman" w:cs="Times New Roman" w:eastAsia="Times New Roman"/>
         </w:rPr>
@@ -2896,6 +3103,8 @@
       <w:r>
         <w:rPr>
           <w:rFonts w:ascii="Times New Roman" w:hAnsi="Times New Roman"/>
+          <w:b w:val="0"/>
+          <w:i w:val="0"/>
           <w:sz w:val="24"/>
           <w:rFonts w:ascii="Times New Roman" w:hAnsi="Times New Roman" w:cs="Times New Roman" w:eastAsia="Times New Roman"/>
         </w:rPr>
@@ -2919,6 +3128,8 @@
       <w:r>
         <w:rPr>
           <w:rFonts w:ascii="Times New Roman" w:hAnsi="Times New Roman"/>
+          <w:b w:val="0"/>
+          <w:i w:val="0"/>
           <w:sz w:val="24"/>
           <w:rFonts w:ascii="Times New Roman" w:hAnsi="Times New Roman" w:cs="Times New Roman" w:eastAsia="Times New Roman"/>
         </w:rPr>
@@ -2942,6 +3153,8 @@
       <w:r>
         <w:rPr>
           <w:rFonts w:ascii="Times New Roman" w:hAnsi="Times New Roman"/>
+          <w:b w:val="0"/>
+          <w:i w:val="0"/>
           <w:sz w:val="24"/>
           <w:rFonts w:ascii="Times New Roman" w:hAnsi="Times New Roman" w:cs="Times New Roman" w:eastAsia="Times New Roman"/>
         </w:rPr>
@@ -2965,6 +3178,8 @@
       <w:r>
         <w:rPr>
           <w:rFonts w:ascii="Times New Roman" w:hAnsi="Times New Roman"/>
+          <w:b w:val="0"/>
+          <w:i w:val="0"/>
           <w:sz w:val="24"/>
           <w:rFonts w:ascii="Times New Roman" w:hAnsi="Times New Roman" w:cs="Times New Roman" w:eastAsia="Times New Roman"/>
         </w:rPr>
@@ -2980,6 +3195,8 @@
       <w:r>
         <w:rPr>
           <w:rFonts w:ascii="Times New Roman" w:hAnsi="Times New Roman"/>
+          <w:b w:val="0"/>
+          <w:i w:val="0"/>
           <w:sz w:val="24"/>
           <w:rFonts w:ascii="Times New Roman" w:hAnsi="Times New Roman" w:cs="Times New Roman" w:eastAsia="Times New Roman"/>
         </w:rPr>
@@ -3014,6 +3231,7 @@
         <w:rPr>
           <w:rFonts w:ascii="Times New Roman" w:hAnsi="Times New Roman"/>
           <w:b/>
+          <w:i w:val="0"/>
           <w:sz w:val="24"/>
           <w:rFonts w:ascii="Times New Roman" w:hAnsi="Times New Roman" w:cs="Times New Roman" w:eastAsia="Times New Roman"/>
         </w:rPr>
@@ -3022,6 +3240,8 @@
       <w:r>
         <w:rPr>
           <w:rFonts w:ascii="Times New Roman" w:hAnsi="Times New Roman"/>
+          <w:b w:val="0"/>
+          <w:i w:val="0"/>
           <w:sz w:val="24"/>
           <w:rFonts w:ascii="Times New Roman" w:hAnsi="Times New Roman" w:cs="Times New Roman" w:eastAsia="Times New Roman"/>
         </w:rPr>
@@ -3037,6 +3257,8 @@
       <w:r>
         <w:rPr>
           <w:rFonts w:ascii="Times New Roman" w:hAnsi="Times New Roman"/>
+          <w:b w:val="0"/>
+          <w:i w:val="0"/>
           <w:sz w:val="24"/>
           <w:rFonts w:ascii="Times New Roman" w:hAnsi="Times New Roman" w:cs="Times New Roman" w:eastAsia="Times New Roman"/>
         </w:rPr>
@@ -3060,6 +3282,8 @@
       <w:r>
         <w:rPr>
           <w:rFonts w:ascii="Times New Roman" w:hAnsi="Times New Roman"/>
+          <w:b w:val="0"/>
+          <w:i w:val="0"/>
           <w:sz w:val="24"/>
           <w:rFonts w:ascii="Times New Roman" w:hAnsi="Times New Roman" w:cs="Times New Roman" w:eastAsia="Times New Roman"/>
         </w:rPr>
@@ -3083,6 +3307,8 @@
       <w:r>
         <w:rPr>
           <w:rFonts w:ascii="Times New Roman" w:hAnsi="Times New Roman"/>
+          <w:b w:val="0"/>
+          <w:i w:val="0"/>
           <w:sz w:val="24"/>
           <w:rFonts w:ascii="Times New Roman" w:hAnsi="Times New Roman" w:cs="Times New Roman" w:eastAsia="Times New Roman"/>
         </w:rPr>
@@ -3106,6 +3332,8 @@
       <w:r>
         <w:rPr>
           <w:rFonts w:ascii="Times New Roman" w:hAnsi="Times New Roman"/>
+          <w:b w:val="0"/>
+          <w:i w:val="0"/>
           <w:sz w:val="24"/>
           <w:rFonts w:ascii="Times New Roman" w:hAnsi="Times New Roman" w:cs="Times New Roman" w:eastAsia="Times New Roman"/>
         </w:rPr>
@@ -3129,6 +3357,8 @@
       <w:r>
         <w:rPr>
           <w:rFonts w:ascii="Times New Roman" w:hAnsi="Times New Roman"/>
+          <w:b w:val="0"/>
+          <w:i w:val="0"/>
           <w:sz w:val="24"/>
           <w:rFonts w:ascii="Times New Roman" w:hAnsi="Times New Roman" w:cs="Times New Roman" w:eastAsia="Times New Roman"/>
         </w:rPr>
@@ -3144,6 +3374,8 @@
       <w:r>
         <w:rPr>
           <w:rFonts w:ascii="Times New Roman" w:hAnsi="Times New Roman"/>
+          <w:b w:val="0"/>
+          <w:i w:val="0"/>
           <w:sz w:val="24"/>
           <w:rFonts w:ascii="Times New Roman" w:hAnsi="Times New Roman" w:cs="Times New Roman" w:eastAsia="Times New Roman"/>
         </w:rPr>
@@ -3167,6 +3399,8 @@
       <w:r>
         <w:rPr>
           <w:rFonts w:ascii="Times New Roman" w:hAnsi="Times New Roman"/>
+          <w:b w:val="0"/>
+          <w:i w:val="0"/>
           <w:sz w:val="24"/>
           <w:rFonts w:ascii="Times New Roman" w:hAnsi="Times New Roman" w:cs="Times New Roman" w:eastAsia="Times New Roman"/>
         </w:rPr>
@@ -3190,6 +3424,8 @@
       <w:r>
         <w:rPr>
           <w:rFonts w:ascii="Times New Roman" w:hAnsi="Times New Roman"/>
+          <w:b w:val="0"/>
+          <w:i w:val="0"/>
           <w:sz w:val="24"/>
           <w:rFonts w:ascii="Times New Roman" w:hAnsi="Times New Roman" w:cs="Times New Roman" w:eastAsia="Times New Roman"/>
         </w:rPr>
@@ -3213,6 +3449,8 @@
       <w:r>
         <w:rPr>
           <w:rFonts w:ascii="Times New Roman" w:hAnsi="Times New Roman"/>
+          <w:b w:val="0"/>
+          <w:i w:val="0"/>
           <w:sz w:val="24"/>
           <w:rFonts w:ascii="Times New Roman" w:hAnsi="Times New Roman" w:cs="Times New Roman" w:eastAsia="Times New Roman"/>
         </w:rPr>
@@ -3228,6 +3466,8 @@
       <w:r>
         <w:rPr>
           <w:rFonts w:ascii="Times New Roman" w:hAnsi="Times New Roman"/>
+          <w:b w:val="0"/>
+          <w:i w:val="0"/>
           <w:sz w:val="24"/>
           <w:rFonts w:ascii="Times New Roman" w:hAnsi="Times New Roman" w:cs="Times New Roman" w:eastAsia="Times New Roman"/>
         </w:rPr>
@@ -3243,6 +3483,8 @@
       <w:r>
         <w:rPr>
           <w:rFonts w:ascii="Times New Roman" w:hAnsi="Times New Roman"/>
+          <w:b w:val="0"/>
+          <w:i w:val="0"/>
           <w:sz w:val="24"/>
           <w:rFonts w:ascii="Times New Roman" w:hAnsi="Times New Roman" w:cs="Times New Roman" w:eastAsia="Times New Roman"/>
         </w:rPr>
@@ -3277,6 +3519,7 @@
         <w:rPr>
           <w:rFonts w:ascii="Times New Roman" w:hAnsi="Times New Roman"/>
           <w:b/>
+          <w:i w:val="0"/>
           <w:sz w:val="24"/>
           <w:rFonts w:ascii="Times New Roman" w:hAnsi="Times New Roman" w:cs="Times New Roman" w:eastAsia="Times New Roman"/>
         </w:rPr>
@@ -3285,6 +3528,8 @@
       <w:r>
         <w:rPr>
           <w:rFonts w:ascii="Times New Roman" w:hAnsi="Times New Roman"/>
+          <w:b w:val="0"/>
+          <w:i w:val="0"/>
           <w:sz w:val="24"/>
           <w:rFonts w:ascii="Times New Roman" w:hAnsi="Times New Roman" w:cs="Times New Roman" w:eastAsia="Times New Roman"/>
         </w:rPr>
@@ -3309,6 +3554,7 @@
         <w:rPr>
           <w:rFonts w:ascii="Times New Roman" w:hAnsi="Times New Roman"/>
           <w:b/>
+          <w:i w:val="0"/>
           <w:sz w:val="24"/>
           <w:rFonts w:ascii="Times New Roman" w:hAnsi="Times New Roman" w:cs="Times New Roman" w:eastAsia="Times New Roman"/>
         </w:rPr>
@@ -3332,6 +3578,8 @@
       <w:r>
         <w:rPr>
           <w:rFonts w:ascii="Times New Roman" w:hAnsi="Times New Roman"/>
+          <w:b w:val="0"/>
+          <w:i w:val="0"/>
           <w:sz w:val="24"/>
           <w:rFonts w:ascii="Times New Roman" w:hAnsi="Times New Roman" w:cs="Times New Roman" w:eastAsia="Times New Roman"/>
         </w:rPr>
@@ -3355,6 +3603,8 @@
       <w:r>
         <w:rPr>
           <w:rFonts w:ascii="Times New Roman" w:hAnsi="Times New Roman"/>
+          <w:b w:val="0"/>
+          <w:i w:val="0"/>
           <w:sz w:val="24"/>
           <w:rFonts w:ascii="Times New Roman" w:hAnsi="Times New Roman" w:cs="Times New Roman" w:eastAsia="Times New Roman"/>
         </w:rPr>
@@ -3379,6 +3629,7 @@
         <w:rPr>
           <w:rFonts w:ascii="Times New Roman" w:hAnsi="Times New Roman"/>
           <w:b/>
+          <w:i w:val="0"/>
           <w:sz w:val="24"/>
           <w:rFonts w:ascii="Times New Roman" w:hAnsi="Times New Roman" w:cs="Times New Roman" w:eastAsia="Times New Roman"/>
         </w:rPr>
@@ -3402,6 +3653,8 @@
       <w:r>
         <w:rPr>
           <w:rFonts w:ascii="Times New Roman" w:hAnsi="Times New Roman"/>
+          <w:b w:val="0"/>
+          <w:i w:val="0"/>
           <w:sz w:val="24"/>
           <w:rFonts w:ascii="Times New Roman" w:hAnsi="Times New Roman" w:cs="Times New Roman" w:eastAsia="Times New Roman"/>
         </w:rPr>
@@ -3411,6 +3664,7 @@
         <w:rPr>
           <w:rFonts w:ascii="Times New Roman" w:hAnsi="Times New Roman"/>
           <w:b/>
+          <w:i w:val="0"/>
           <w:sz w:val="24"/>
           <w:rFonts w:ascii="Times New Roman" w:hAnsi="Times New Roman" w:cs="Times New Roman" w:eastAsia="Times New Roman"/>
         </w:rPr>
@@ -3419,6 +3673,8 @@
       <w:r>
         <w:rPr>
           <w:rFonts w:ascii="Times New Roman" w:hAnsi="Times New Roman"/>
+          <w:b w:val="0"/>
+          <w:i w:val="0"/>
           <w:sz w:val="24"/>
           <w:rFonts w:ascii="Times New Roman" w:hAnsi="Times New Roman" w:cs="Times New Roman" w:eastAsia="Times New Roman"/>
         </w:rPr>
@@ -3427,6 +3683,7 @@
       <w:r>
         <w:rPr>
           <w:rFonts w:ascii="Times New Roman" w:hAnsi="Times New Roman"/>
+          <w:b w:val="0"/>
           <w:i/>
           <w:sz w:val="24"/>
           <w:rFonts w:ascii="Times New Roman" w:hAnsi="Times New Roman" w:cs="Times New Roman" w:eastAsia="Times New Roman"/>
@@ -3436,6 +3693,8 @@
       <w:r>
         <w:rPr>
           <w:rFonts w:ascii="Times New Roman" w:hAnsi="Times New Roman"/>
+          <w:b w:val="0"/>
+          <w:i w:val="0"/>
           <w:sz w:val="24"/>
           <w:rFonts w:ascii="Times New Roman" w:hAnsi="Times New Roman" w:cs="Times New Roman" w:eastAsia="Times New Roman"/>
         </w:rPr>
@@ -3444,6 +3703,7 @@
       <w:r>
         <w:rPr>
           <w:rFonts w:ascii="Times New Roman" w:hAnsi="Times New Roman"/>
+          <w:b w:val="0"/>
           <w:i/>
           <w:sz w:val="24"/>
           <w:rFonts w:ascii="Times New Roman" w:hAnsi="Times New Roman" w:cs="Times New Roman" w:eastAsia="Times New Roman"/>
@@ -3453,6 +3713,8 @@
       <w:r>
         <w:rPr>
           <w:rFonts w:ascii="Times New Roman" w:hAnsi="Times New Roman"/>
+          <w:b w:val="0"/>
+          <w:i w:val="0"/>
           <w:sz w:val="24"/>
           <w:rFonts w:ascii="Times New Roman" w:hAnsi="Times New Roman" w:cs="Times New Roman" w:eastAsia="Times New Roman"/>
         </w:rPr>
@@ -3477,6 +3739,7 @@
         <w:rPr>
           <w:rFonts w:ascii="Times New Roman" w:hAnsi="Times New Roman"/>
           <w:b/>
+          <w:i w:val="0"/>
           <w:sz w:val="24"/>
           <w:rFonts w:ascii="Times New Roman" w:hAnsi="Times New Roman" w:cs="Times New Roman" w:eastAsia="Times New Roman"/>
         </w:rPr>
@@ -3501,6 +3764,7 @@
         <w:rPr>
           <w:rFonts w:ascii="Times New Roman" w:hAnsi="Times New Roman"/>
           <w:b/>
+          <w:i w:val="0"/>
           <w:sz w:val="24"/>
           <w:rFonts w:ascii="Times New Roman" w:hAnsi="Times New Roman" w:cs="Times New Roman" w:eastAsia="Times New Roman"/>
         </w:rPr>
@@ -3509,6 +3773,8 @@
       <w:r>
         <w:rPr>
           <w:rFonts w:ascii="Times New Roman" w:hAnsi="Times New Roman"/>
+          <w:b w:val="0"/>
+          <w:i w:val="0"/>
           <w:sz w:val="24"/>
           <w:rFonts w:ascii="Times New Roman" w:hAnsi="Times New Roman" w:cs="Times New Roman" w:eastAsia="Times New Roman"/>
         </w:rPr>
@@ -3533,6 +3799,7 @@
         <w:rPr>
           <w:rFonts w:ascii="Times New Roman" w:hAnsi="Times New Roman"/>
           <w:b/>
+          <w:i w:val="0"/>
           <w:sz w:val="24"/>
           <w:rFonts w:ascii="Times New Roman" w:hAnsi="Times New Roman" w:cs="Times New Roman" w:eastAsia="Times New Roman"/>
         </w:rPr>
@@ -3541,6 +3808,8 @@
       <w:r>
         <w:rPr>
           <w:rFonts w:ascii="Times New Roman" w:hAnsi="Times New Roman"/>
+          <w:b w:val="0"/>
+          <w:i w:val="0"/>
           <w:sz w:val="24"/>
           <w:rFonts w:ascii="Times New Roman" w:hAnsi="Times New Roman" w:cs="Times New Roman" w:eastAsia="Times New Roman"/>
         </w:rPr>
@@ -3556,6 +3825,8 @@
       <w:r>
         <w:rPr>
           <w:rFonts w:ascii="Times New Roman" w:hAnsi="Times New Roman"/>
+          <w:b w:val="0"/>
+          <w:i w:val="0"/>
           <w:sz w:val="24"/>
           <w:rFonts w:ascii="Times New Roman" w:hAnsi="Times New Roman" w:cs="Times New Roman" w:eastAsia="Times New Roman"/>
         </w:rPr>
@@ -3590,6 +3861,7 @@
         <w:rPr>
           <w:rFonts w:ascii="Times New Roman" w:hAnsi="Times New Roman"/>
           <w:b/>
+          <w:i w:val="0"/>
           <w:sz w:val="24"/>
           <w:rFonts w:ascii="Times New Roman" w:hAnsi="Times New Roman" w:cs="Times New Roman" w:eastAsia="Times New Roman"/>
         </w:rPr>
@@ -3598,6 +3870,8 @@
       <w:r>
         <w:rPr>
           <w:rFonts w:ascii="Times New Roman" w:hAnsi="Times New Roman"/>
+          <w:b w:val="0"/>
+          <w:i w:val="0"/>
           <w:sz w:val="24"/>
           <w:rFonts w:ascii="Times New Roman" w:hAnsi="Times New Roman" w:cs="Times New Roman" w:eastAsia="Times New Roman"/>
         </w:rPr>
@@ -3622,6 +3896,7 @@
         <w:rPr>
           <w:rFonts w:ascii="Times New Roman" w:hAnsi="Times New Roman"/>
           <w:b/>
+          <w:i w:val="0"/>
           <w:sz w:val="24"/>
           <w:rFonts w:ascii="Times New Roman" w:hAnsi="Times New Roman" w:cs="Times New Roman" w:eastAsia="Times New Roman"/>
         </w:rPr>
@@ -3630,6 +3905,8 @@
       <w:r>
         <w:rPr>
           <w:rFonts w:ascii="Times New Roman" w:hAnsi="Times New Roman"/>
+          <w:b w:val="0"/>
+          <w:i w:val="0"/>
           <w:sz w:val="24"/>
           <w:rFonts w:ascii="Times New Roman" w:hAnsi="Times New Roman" w:cs="Times New Roman" w:eastAsia="Times New Roman"/>
         </w:rPr>
@@ -3654,6 +3931,7 @@
         <w:rPr>
           <w:rFonts w:ascii="Times New Roman" w:hAnsi="Times New Roman"/>
           <w:b/>
+          <w:i w:val="0"/>
           <w:sz w:val="24"/>
           <w:rFonts w:ascii="Times New Roman" w:hAnsi="Times New Roman" w:cs="Times New Roman" w:eastAsia="Times New Roman"/>
         </w:rPr>
@@ -3678,6 +3956,7 @@
         <w:rPr>
           <w:rFonts w:ascii="Times New Roman" w:hAnsi="Times New Roman"/>
           <w:b/>
+          <w:i w:val="0"/>
           <w:sz w:val="24"/>
           <w:rFonts w:ascii="Times New Roman" w:hAnsi="Times New Roman" w:cs="Times New Roman" w:eastAsia="Times New Roman"/>
         </w:rPr>
@@ -3686,6 +3965,8 @@
       <w:r>
         <w:rPr>
           <w:rFonts w:ascii="Times New Roman" w:hAnsi="Times New Roman"/>
+          <w:b w:val="0"/>
+          <w:i w:val="0"/>
           <w:sz w:val="24"/>
           <w:rFonts w:ascii="Times New Roman" w:hAnsi="Times New Roman" w:cs="Times New Roman" w:eastAsia="Times New Roman"/>
         </w:rPr>
@@ -3694,6 +3975,7 @@
       <w:r>
         <w:rPr>
           <w:rFonts w:ascii="Times New Roman" w:hAnsi="Times New Roman"/>
+          <w:b w:val="0"/>
           <w:i/>
           <w:sz w:val="24"/>
           <w:rFonts w:ascii="Times New Roman" w:hAnsi="Times New Roman" w:cs="Times New Roman" w:eastAsia="Times New Roman"/>
@@ -3703,6 +3985,7 @@
       <w:r>
         <w:rPr>
           <w:rFonts w:ascii="Times New Roman" w:hAnsi="Times New Roman"/>
+          <w:b w:val="0"/>
           <w:sz w:val="24"/>
           <w:rFonts w:ascii="Times New Roman" w:hAnsi="Times New Roman" w:cs="Times New Roman" w:eastAsia="Times New Roman"/>
           <w:vertAlign w:val="superscript"/>
@@ -3712,6 +3995,8 @@
       <w:r>
         <w:rPr>
           <w:rFonts w:ascii="Times New Roman" w:hAnsi="Times New Roman"/>
+          <w:b w:val="0"/>
+          <w:i w:val="0"/>
           <w:sz w:val="24"/>
           <w:rFonts w:ascii="Times New Roman" w:hAnsi="Times New Roman" w:cs="Times New Roman" w:eastAsia="Times New Roman"/>
         </w:rPr>
@@ -3736,6 +4021,7 @@
         <w:rPr>
           <w:rFonts w:ascii="Times New Roman" w:hAnsi="Times New Roman"/>
           <w:b/>
+          <w:i w:val="0"/>
           <w:sz w:val="24"/>
           <w:rFonts w:ascii="Times New Roman" w:hAnsi="Times New Roman" w:cs="Times New Roman" w:eastAsia="Times New Roman"/>
         </w:rPr>
@@ -3744,6 +4030,8 @@
       <w:r>
         <w:rPr>
           <w:rFonts w:ascii="Times New Roman" w:hAnsi="Times New Roman"/>
+          <w:b w:val="0"/>
+          <w:i w:val="0"/>
           <w:sz w:val="24"/>
           <w:rFonts w:ascii="Times New Roman" w:hAnsi="Times New Roman" w:cs="Times New Roman" w:eastAsia="Times New Roman"/>
         </w:rPr>
@@ -3759,6 +4047,8 @@
       <w:r>
         <w:rPr>
           <w:rFonts w:ascii="Times New Roman" w:hAnsi="Times New Roman"/>
+          <w:b w:val="0"/>
+          <w:i w:val="0"/>
           <w:sz w:val="24"/>
           <w:rFonts w:ascii="Times New Roman" w:hAnsi="Times New Roman" w:cs="Times New Roman" w:eastAsia="Times New Roman"/>
         </w:rPr>
@@ -3793,6 +4083,7 @@
         <w:rPr>
           <w:rFonts w:ascii="Times New Roman" w:hAnsi="Times New Roman"/>
           <w:b/>
+          <w:i w:val="0"/>
           <w:sz w:val="24"/>
           <w:rFonts w:ascii="Times New Roman" w:hAnsi="Times New Roman" w:cs="Times New Roman" w:eastAsia="Times New Roman"/>
         </w:rPr>
@@ -3801,6 +4092,8 @@
       <w:r>
         <w:rPr>
           <w:rFonts w:ascii="Times New Roman" w:hAnsi="Times New Roman"/>
+          <w:b w:val="0"/>
+          <w:i w:val="0"/>
           <w:sz w:val="24"/>
           <w:rFonts w:ascii="Times New Roman" w:hAnsi="Times New Roman" w:cs="Times New Roman" w:eastAsia="Times New Roman"/>
         </w:rPr>
@@ -3825,6 +4118,7 @@
         <w:rPr>
           <w:rFonts w:ascii="Times New Roman" w:hAnsi="Times New Roman"/>
           <w:b/>
+          <w:i w:val="0"/>
           <w:sz w:val="24"/>
           <w:rFonts w:ascii="Times New Roman" w:hAnsi="Times New Roman" w:cs="Times New Roman" w:eastAsia="Times New Roman"/>
         </w:rPr>
@@ -3833,6 +4127,8 @@
       <w:r>
         <w:rPr>
           <w:rFonts w:ascii="Times New Roman" w:hAnsi="Times New Roman"/>
+          <w:b w:val="0"/>
+          <w:i w:val="0"/>
           <w:sz w:val="24"/>
           <w:rFonts w:ascii="Times New Roman" w:hAnsi="Times New Roman" w:cs="Times New Roman" w:eastAsia="Times New Roman"/>
         </w:rPr>
@@ -3857,6 +4153,7 @@
         <w:rPr>
           <w:rFonts w:ascii="Times New Roman" w:hAnsi="Times New Roman"/>
           <w:b/>
+          <w:i w:val="0"/>
           <w:sz w:val="24"/>
           <w:rFonts w:ascii="Times New Roman" w:hAnsi="Times New Roman" w:cs="Times New Roman" w:eastAsia="Times New Roman"/>
         </w:rPr>
@@ -3865,6 +4162,8 @@
       <w:r>
         <w:rPr>
           <w:rFonts w:ascii="Times New Roman" w:hAnsi="Times New Roman"/>
+          <w:b w:val="0"/>
+          <w:i w:val="0"/>
           <w:sz w:val="24"/>
           <w:rFonts w:ascii="Times New Roman" w:hAnsi="Times New Roman" w:cs="Times New Roman" w:eastAsia="Times New Roman"/>
         </w:rPr>
@@ -3880,6 +4179,8 @@
       <w:r>
         <w:rPr>
           <w:rFonts w:ascii="Times New Roman" w:hAnsi="Times New Roman"/>
+          <w:b w:val="0"/>
+          <w:i w:val="0"/>
           <w:sz w:val="24"/>
           <w:rFonts w:ascii="Times New Roman" w:hAnsi="Times New Roman" w:cs="Times New Roman" w:eastAsia="Times New Roman"/>
         </w:rPr>
@@ -3914,6 +4215,7 @@
         <w:rPr>
           <w:rFonts w:ascii="Times New Roman" w:hAnsi="Times New Roman"/>
           <w:b/>
+          <w:i w:val="0"/>
           <w:sz w:val="24"/>
           <w:rFonts w:ascii="Times New Roman" w:hAnsi="Times New Roman" w:cs="Times New Roman" w:eastAsia="Times New Roman"/>
         </w:rPr>
@@ -3922,6 +4224,8 @@
       <w:r>
         <w:rPr>
           <w:rFonts w:ascii="Times New Roman" w:hAnsi="Times New Roman"/>
+          <w:b w:val="0"/>
+          <w:i w:val="0"/>
           <w:sz w:val="24"/>
           <w:rFonts w:ascii="Times New Roman" w:hAnsi="Times New Roman" w:cs="Times New Roman" w:eastAsia="Times New Roman"/>
         </w:rPr>
@@ -3946,6 +4250,7 @@
         <w:rPr>
           <w:rFonts w:ascii="Times New Roman" w:hAnsi="Times New Roman"/>
           <w:b/>
+          <w:i w:val="0"/>
           <w:sz w:val="24"/>
           <w:rFonts w:ascii="Times New Roman" w:hAnsi="Times New Roman" w:cs="Times New Roman" w:eastAsia="Times New Roman"/>
         </w:rPr>
@@ -3954,6 +4259,8 @@
       <w:r>
         <w:rPr>
           <w:rFonts w:ascii="Times New Roman" w:hAnsi="Times New Roman"/>
+          <w:b w:val="0"/>
+          <w:i w:val="0"/>
           <w:sz w:val="24"/>
           <w:rFonts w:ascii="Times New Roman" w:hAnsi="Times New Roman" w:cs="Times New Roman" w:eastAsia="Times New Roman"/>
         </w:rPr>
@@ -3962,6 +4269,7 @@
       <w:r>
         <w:rPr>
           <w:rFonts w:ascii="Times New Roman" w:hAnsi="Times New Roman"/>
+          <w:b w:val="0"/>
           <w:i/>
           <w:sz w:val="24"/>
           <w:rFonts w:ascii="Times New Roman" w:hAnsi="Times New Roman" w:cs="Times New Roman" w:eastAsia="Times New Roman"/>
@@ -3971,6 +4279,8 @@
       <w:r>
         <w:rPr>
           <w:rFonts w:ascii="Times New Roman" w:hAnsi="Times New Roman"/>
+          <w:b w:val="0"/>
+          <w:i w:val="0"/>
           <w:sz w:val="24"/>
           <w:rFonts w:ascii="Times New Roman" w:hAnsi="Times New Roman" w:cs="Times New Roman" w:eastAsia="Times New Roman"/>
         </w:rPr>
@@ -3995,6 +4305,7 @@
         <w:rPr>
           <w:rFonts w:ascii="Times New Roman" w:hAnsi="Times New Roman"/>
           <w:b/>
+          <w:i w:val="0"/>
           <w:sz w:val="24"/>
           <w:rFonts w:ascii="Times New Roman" w:hAnsi="Times New Roman" w:cs="Times New Roman" w:eastAsia="Times New Roman"/>
         </w:rPr>
@@ -4003,6 +4314,8 @@
       <w:r>
         <w:rPr>
           <w:rFonts w:ascii="Times New Roman" w:hAnsi="Times New Roman"/>
+          <w:b w:val="0"/>
+          <w:i w:val="0"/>
           <w:sz w:val="24"/>
           <w:rFonts w:ascii="Times New Roman" w:hAnsi="Times New Roman" w:cs="Times New Roman" w:eastAsia="Times New Roman"/>
         </w:rPr>
@@ -4027,6 +4340,7 @@
         <w:rPr>
           <w:rFonts w:ascii="Times New Roman" w:hAnsi="Times New Roman"/>
           <w:b/>
+          <w:i w:val="0"/>
           <w:sz w:val="24"/>
           <w:rFonts w:ascii="Times New Roman" w:hAnsi="Times New Roman" w:cs="Times New Roman" w:eastAsia="Times New Roman"/>
         </w:rPr>
@@ -4035,6 +4349,8 @@
       <w:r>
         <w:rPr>
           <w:rFonts w:ascii="Times New Roman" w:hAnsi="Times New Roman"/>
+          <w:b w:val="0"/>
+          <w:i w:val="0"/>
           <w:sz w:val="24"/>
           <w:rFonts w:ascii="Times New Roman" w:hAnsi="Times New Roman" w:cs="Times New Roman" w:eastAsia="Times New Roman"/>
         </w:rPr>
@@ -4050,6 +4366,8 @@
       <w:r>
         <w:rPr>
           <w:rFonts w:ascii="Times New Roman" w:hAnsi="Times New Roman"/>
+          <w:b w:val="0"/>
+          <w:i w:val="0"/>
           <w:sz w:val="24"/>
           <w:rFonts w:ascii="Times New Roman" w:hAnsi="Times New Roman" w:cs="Times New Roman" w:eastAsia="Times New Roman"/>
         </w:rPr>
@@ -4084,6 +4402,7 @@
         <w:rPr>
           <w:rFonts w:ascii="Times New Roman" w:hAnsi="Times New Roman"/>
           <w:b/>
+          <w:i w:val="0"/>
           <w:sz w:val="24"/>
           <w:rFonts w:ascii="Times New Roman" w:hAnsi="Times New Roman" w:cs="Times New Roman" w:eastAsia="Times New Roman"/>
         </w:rPr>
@@ -4092,6 +4411,8 @@
       <w:r>
         <w:rPr>
           <w:rFonts w:ascii="Times New Roman" w:hAnsi="Times New Roman"/>
+          <w:b w:val="0"/>
+          <w:i w:val="0"/>
           <w:sz w:val="24"/>
           <w:rFonts w:ascii="Times New Roman" w:hAnsi="Times New Roman" w:cs="Times New Roman" w:eastAsia="Times New Roman"/>
         </w:rPr>
@@ -4101,6 +4422,7 @@
         <w:rPr>
           <w:rFonts w:ascii="Times New Roman" w:hAnsi="Times New Roman"/>
           <w:b/>
+          <w:i w:val="0"/>
           <w:sz w:val="24"/>
           <w:rFonts w:ascii="Times New Roman" w:hAnsi="Times New Roman" w:cs="Times New Roman" w:eastAsia="Times New Roman"/>
         </w:rPr>
@@ -4109,6 +4431,8 @@
       <w:r>
         <w:rPr>
           <w:rFonts w:ascii="Times New Roman" w:hAnsi="Times New Roman"/>
+          <w:b w:val="0"/>
+          <w:i w:val="0"/>
           <w:sz w:val="24"/>
           <w:rFonts w:ascii="Times New Roman" w:hAnsi="Times New Roman" w:cs="Times New Roman" w:eastAsia="Times New Roman"/>
         </w:rPr>
@@ -4133,6 +4457,7 @@
         <w:rPr>
           <w:rFonts w:ascii="Times New Roman" w:hAnsi="Times New Roman"/>
           <w:b/>
+          <w:i w:val="0"/>
           <w:sz w:val="24"/>
           <w:rFonts w:ascii="Times New Roman" w:hAnsi="Times New Roman" w:cs="Times New Roman" w:eastAsia="Times New Roman"/>
         </w:rPr>
@@ -4141,6 +4466,8 @@
       <w:r>
         <w:rPr>
           <w:rFonts w:ascii="Times New Roman" w:hAnsi="Times New Roman"/>
+          <w:b w:val="0"/>
+          <w:i w:val="0"/>
           <w:sz w:val="24"/>
           <w:rFonts w:ascii="Times New Roman" w:hAnsi="Times New Roman" w:cs="Times New Roman" w:eastAsia="Times New Roman"/>
         </w:rPr>
@@ -4165,6 +4492,7 @@
         <w:rPr>
           <w:rFonts w:ascii="Times New Roman" w:hAnsi="Times New Roman"/>
           <w:b/>
+          <w:i w:val="0"/>
           <w:sz w:val="24"/>
           <w:rFonts w:ascii="Times New Roman" w:hAnsi="Times New Roman" w:cs="Times New Roman" w:eastAsia="Times New Roman"/>
         </w:rPr>
@@ -4173,6 +4501,8 @@
       <w:r>
         <w:rPr>
           <w:rFonts w:ascii="Times New Roman" w:hAnsi="Times New Roman"/>
+          <w:b w:val="0"/>
+          <w:i w:val="0"/>
           <w:sz w:val="24"/>
           <w:rFonts w:ascii="Times New Roman" w:hAnsi="Times New Roman" w:cs="Times New Roman" w:eastAsia="Times New Roman"/>
         </w:rPr>
@@ -4197,6 +4527,7 @@
         <w:rPr>
           <w:rFonts w:ascii="Times New Roman" w:hAnsi="Times New Roman"/>
           <w:b/>
+          <w:i w:val="0"/>
           <w:sz w:val="24"/>
           <w:rFonts w:ascii="Times New Roman" w:hAnsi="Times New Roman" w:cs="Times New Roman" w:eastAsia="Times New Roman"/>
         </w:rPr>
@@ -4205,6 +4536,8 @@
       <w:r>
         <w:rPr>
           <w:rFonts w:ascii="Times New Roman" w:hAnsi="Times New Roman"/>
+          <w:b w:val="0"/>
+          <w:i w:val="0"/>
           <w:sz w:val="24"/>
           <w:rFonts w:ascii="Times New Roman" w:hAnsi="Times New Roman" w:cs="Times New Roman" w:eastAsia="Times New Roman"/>
         </w:rPr>
@@ -4220,6 +4553,8 @@
       <w:r>
         <w:rPr>
           <w:rFonts w:ascii="Times New Roman" w:hAnsi="Times New Roman"/>
+          <w:b w:val="0"/>
+          <w:i w:val="0"/>
           <w:sz w:val="24"/>
           <w:rFonts w:ascii="Times New Roman" w:hAnsi="Times New Roman" w:cs="Times New Roman" w:eastAsia="Times New Roman"/>
         </w:rPr>
@@ -4272,6 +4607,7 @@
         <w:rPr>
           <w:rFonts w:ascii="Times New Roman" w:hAnsi="Times New Roman"/>
           <w:b/>
+          <w:i w:val="0"/>
           <w:sz w:val="24"/>
           <w:rFonts w:ascii="Times New Roman" w:hAnsi="Times New Roman" w:cs="Times New Roman" w:eastAsia="Times New Roman"/>
         </w:rPr>
@@ -4280,6 +4616,8 @@
       <w:r>
         <w:rPr>
           <w:rFonts w:ascii="Times New Roman" w:hAnsi="Times New Roman"/>
+          <w:b w:val="0"/>
+          <w:i w:val="0"/>
           <w:sz w:val="24"/>
           <w:rFonts w:ascii="Times New Roman" w:hAnsi="Times New Roman" w:cs="Times New Roman" w:eastAsia="Times New Roman"/>
         </w:rPr>
@@ -4295,6 +4633,8 @@
       <w:r>
         <w:rPr>
           <w:rFonts w:ascii="Times New Roman" w:hAnsi="Times New Roman"/>
+          <w:b w:val="0"/>
+          <w:i w:val="0"/>
           <w:sz w:val="24"/>
           <w:rFonts w:ascii="Times New Roman" w:hAnsi="Times New Roman" w:cs="Times New Roman" w:eastAsia="Times New Roman"/>
         </w:rPr>
@@ -4310,6 +4650,8 @@
       <w:r>
         <w:rPr>
           <w:rFonts w:ascii="Times New Roman" w:hAnsi="Times New Roman"/>
+          <w:b w:val="0"/>
+          <w:i w:val="0"/>
           <w:sz w:val="24"/>
           <w:rFonts w:ascii="Times New Roman" w:hAnsi="Times New Roman" w:cs="Times New Roman" w:eastAsia="Times New Roman"/>
         </w:rPr>
@@ -4344,6 +4686,7 @@
         <w:rPr>
           <w:rFonts w:ascii="Times New Roman" w:hAnsi="Times New Roman"/>
           <w:b/>
+          <w:i w:val="0"/>
           <w:sz w:val="24"/>
           <w:rFonts w:ascii="Times New Roman" w:hAnsi="Times New Roman" w:cs="Times New Roman" w:eastAsia="Times New Roman"/>
         </w:rPr>
@@ -4352,6 +4695,8 @@
       <w:r>
         <w:rPr>
           <w:rFonts w:ascii="Times New Roman" w:hAnsi="Times New Roman"/>
+          <w:b w:val="0"/>
+          <w:i w:val="0"/>
           <w:sz w:val="24"/>
           <w:rFonts w:ascii="Times New Roman" w:hAnsi="Times New Roman" w:cs="Times New Roman" w:eastAsia="Times New Roman"/>
         </w:rPr>
@@ -4375,6 +4720,8 @@
       <w:r>
         <w:rPr>
           <w:rFonts w:ascii="Times New Roman" w:hAnsi="Times New Roman"/>
+          <w:b w:val="0"/>
+          <w:i w:val="0"/>
           <w:sz w:val="24"/>
           <w:rFonts w:ascii="Times New Roman" w:hAnsi="Times New Roman" w:cs="Times New Roman" w:eastAsia="Times New Roman"/>
         </w:rPr>
@@ -4398,6 +4745,8 @@
       <w:r>
         <w:rPr>
           <w:rFonts w:ascii="Times New Roman" w:hAnsi="Times New Roman"/>
+          <w:b w:val="0"/>
+          <w:i w:val="0"/>
           <w:sz w:val="24"/>
           <w:rFonts w:ascii="Times New Roman" w:hAnsi="Times New Roman" w:cs="Times New Roman" w:eastAsia="Times New Roman"/>
         </w:rPr>
@@ -4421,6 +4770,8 @@
       <w:r>
         <w:rPr>
           <w:rFonts w:ascii="Times New Roman" w:hAnsi="Times New Roman"/>
+          <w:b w:val="0"/>
+          <w:i w:val="0"/>
           <w:sz w:val="24"/>
           <w:rFonts w:ascii="Times New Roman" w:hAnsi="Times New Roman" w:cs="Times New Roman" w:eastAsia="Times New Roman"/>
         </w:rPr>
@@ -4444,6 +4795,8 @@
       <w:r>
         <w:rPr>
           <w:rFonts w:ascii="Times New Roman" w:hAnsi="Times New Roman"/>
+          <w:b w:val="0"/>
+          <w:i w:val="0"/>
           <w:sz w:val="24"/>
           <w:rFonts w:ascii="Times New Roman" w:hAnsi="Times New Roman" w:cs="Times New Roman" w:eastAsia="Times New Roman"/>
         </w:rPr>
@@ -4459,6 +4812,8 @@
       <w:r>
         <w:rPr>
           <w:rFonts w:ascii="Times New Roman" w:hAnsi="Times New Roman"/>
+          <w:b w:val="0"/>
+          <w:i w:val="0"/>
           <w:sz w:val="24"/>
           <w:rFonts w:ascii="Times New Roman" w:hAnsi="Times New Roman" w:cs="Times New Roman" w:eastAsia="Times New Roman"/>
         </w:rPr>
@@ -4474,6 +4829,8 @@
       <w:r>
         <w:rPr>
           <w:rFonts w:ascii="Times New Roman" w:hAnsi="Times New Roman"/>
+          <w:b w:val="0"/>
+          <w:i w:val="0"/>
           <w:sz w:val="24"/>
           <w:rFonts w:ascii="Times New Roman" w:hAnsi="Times New Roman" w:cs="Times New Roman" w:eastAsia="Times New Roman"/>
         </w:rPr>
@@ -4508,6 +4865,7 @@
         <w:rPr>
           <w:rFonts w:ascii="Times New Roman" w:hAnsi="Times New Roman"/>
           <w:b/>
+          <w:i w:val="0"/>
           <w:sz w:val="24"/>
           <w:rFonts w:ascii="Times New Roman" w:hAnsi="Times New Roman" w:cs="Times New Roman" w:eastAsia="Times New Roman"/>
         </w:rPr>
@@ -4516,6 +4874,8 @@
       <w:r>
         <w:rPr>
           <w:rFonts w:ascii="Times New Roman" w:hAnsi="Times New Roman"/>
+          <w:b w:val="0"/>
+          <w:i w:val="0"/>
           <w:sz w:val="24"/>
           <w:rFonts w:ascii="Times New Roman" w:hAnsi="Times New Roman" w:cs="Times New Roman" w:eastAsia="Times New Roman"/>
         </w:rPr>
@@ -4531,6 +4891,8 @@
       <w:r>
         <w:rPr>
           <w:rFonts w:ascii="Times New Roman" w:hAnsi="Times New Roman"/>
+          <w:b w:val="0"/>
+          <w:i w:val="0"/>
           <w:sz w:val="24"/>
           <w:rFonts w:ascii="Times New Roman" w:hAnsi="Times New Roman" w:cs="Times New Roman" w:eastAsia="Times New Roman"/>
         </w:rPr>
@@ -4554,6 +4916,8 @@
       <w:r>
         <w:rPr>
           <w:rFonts w:ascii="Times New Roman" w:hAnsi="Times New Roman"/>
+          <w:b w:val="0"/>
+          <w:i w:val="0"/>
           <w:sz w:val="24"/>
           <w:rFonts w:ascii="Times New Roman" w:hAnsi="Times New Roman" w:cs="Times New Roman" w:eastAsia="Times New Roman"/>
         </w:rPr>
@@ -4577,6 +4941,8 @@
       <w:r>
         <w:rPr>
           <w:rFonts w:ascii="Times New Roman" w:hAnsi="Times New Roman"/>
+          <w:b w:val="0"/>
+          <w:i w:val="0"/>
           <w:sz w:val="24"/>
           <w:rFonts w:ascii="Times New Roman" w:hAnsi="Times New Roman" w:cs="Times New Roman" w:eastAsia="Times New Roman"/>
         </w:rPr>
@@ -4600,6 +4966,8 @@
       <w:r>
         <w:rPr>
           <w:rFonts w:ascii="Times New Roman" w:hAnsi="Times New Roman"/>
+          <w:b w:val="0"/>
+          <w:i w:val="0"/>
           <w:sz w:val="24"/>
           <w:rFonts w:ascii="Times New Roman" w:hAnsi="Times New Roman" w:cs="Times New Roman" w:eastAsia="Times New Roman"/>
         </w:rPr>
@@ -4623,6 +4991,8 @@
       <w:r>
         <w:rPr>
           <w:rFonts w:ascii="Times New Roman" w:hAnsi="Times New Roman"/>
+          <w:b w:val="0"/>
+          <w:i w:val="0"/>
           <w:sz w:val="24"/>
           <w:rFonts w:ascii="Times New Roman" w:hAnsi="Times New Roman" w:cs="Times New Roman" w:eastAsia="Times New Roman"/>
         </w:rPr>
@@ -4638,6 +5008,8 @@
       <w:r>
         <w:rPr>
           <w:rFonts w:ascii="Times New Roman" w:hAnsi="Times New Roman"/>
+          <w:b w:val="0"/>
+          <w:i w:val="0"/>
           <w:sz w:val="24"/>
           <w:rFonts w:ascii="Times New Roman" w:hAnsi="Times New Roman" w:cs="Times New Roman" w:eastAsia="Times New Roman"/>
         </w:rPr>
@@ -4690,6 +5062,7 @@
         <w:rPr>
           <w:rFonts w:ascii="Times New Roman" w:hAnsi="Times New Roman"/>
           <w:b/>
+          <w:i w:val="0"/>
           <w:sz w:val="24"/>
           <w:rFonts w:ascii="Times New Roman" w:hAnsi="Times New Roman" w:cs="Times New Roman" w:eastAsia="Times New Roman"/>
         </w:rPr>
@@ -4698,6 +5071,8 @@
       <w:r>
         <w:rPr>
           <w:rFonts w:ascii="Times New Roman" w:hAnsi="Times New Roman"/>
+          <w:b w:val="0"/>
+          <w:i w:val="0"/>
           <w:sz w:val="24"/>
           <w:rFonts w:ascii="Times New Roman" w:hAnsi="Times New Roman" w:cs="Times New Roman" w:eastAsia="Times New Roman"/>
         </w:rPr>
@@ -4721,6 +5096,8 @@
       <w:r>
         <w:rPr>
           <w:rFonts w:ascii="Times New Roman" w:hAnsi="Times New Roman"/>
+          <w:b w:val="0"/>
+          <w:i w:val="0"/>
           <w:sz w:val="24"/>
           <w:rFonts w:ascii="Times New Roman" w:hAnsi="Times New Roman" w:cs="Times New Roman" w:eastAsia="Times New Roman"/>
         </w:rPr>
@@ -4744,6 +5121,8 @@
       <w:r>
         <w:rPr>
           <w:rFonts w:ascii="Times New Roman" w:hAnsi="Times New Roman"/>
+          <w:b w:val="0"/>
+          <w:i w:val="0"/>
           <w:sz w:val="24"/>
           <w:rFonts w:ascii="Times New Roman" w:hAnsi="Times New Roman" w:cs="Times New Roman" w:eastAsia="Times New Roman"/>
         </w:rPr>
@@ -4767,6 +5146,8 @@
       <w:r>
         <w:rPr>
           <w:rFonts w:ascii="Times New Roman" w:hAnsi="Times New Roman"/>
+          <w:b w:val="0"/>
+          <w:i w:val="0"/>
           <w:sz w:val="24"/>
           <w:rFonts w:ascii="Times New Roman" w:hAnsi="Times New Roman" w:cs="Times New Roman" w:eastAsia="Times New Roman"/>
         </w:rPr>
@@ -4790,6 +5171,8 @@
       <w:r>
         <w:rPr>
           <w:rFonts w:ascii="Times New Roman" w:hAnsi="Times New Roman"/>
+          <w:b w:val="0"/>
+          <w:i w:val="0"/>
           <w:sz w:val="24"/>
           <w:rFonts w:ascii="Times New Roman" w:hAnsi="Times New Roman" w:cs="Times New Roman" w:eastAsia="Times New Roman"/>
         </w:rPr>
@@ -4813,6 +5196,8 @@
       <w:r>
         <w:rPr>
           <w:rFonts w:ascii="Times New Roman" w:hAnsi="Times New Roman"/>
+          <w:b w:val="0"/>
+          <w:i w:val="0"/>
           <w:sz w:val="24"/>
           <w:rFonts w:ascii="Times New Roman" w:hAnsi="Times New Roman" w:cs="Times New Roman" w:eastAsia="Times New Roman"/>
         </w:rPr>
@@ -4836,6 +5221,8 @@
       <w:r>
         <w:rPr>
           <w:rFonts w:ascii="Times New Roman" w:hAnsi="Times New Roman"/>
+          <w:b w:val="0"/>
+          <w:i w:val="0"/>
           <w:sz w:val="24"/>
           <w:rFonts w:ascii="Times New Roman" w:hAnsi="Times New Roman" w:cs="Times New Roman" w:eastAsia="Times New Roman"/>
         </w:rPr>
@@ -4851,6 +5238,8 @@
       <w:r>
         <w:rPr>
           <w:rFonts w:ascii="Times New Roman" w:hAnsi="Times New Roman"/>
+          <w:b w:val="0"/>
+          <w:i w:val="0"/>
           <w:sz w:val="24"/>
           <w:rFonts w:ascii="Times New Roman" w:hAnsi="Times New Roman" w:cs="Times New Roman" w:eastAsia="Times New Roman"/>
         </w:rPr>
@@ -4866,6 +5255,8 @@
       <w:r>
         <w:rPr>
           <w:rFonts w:ascii="Times New Roman" w:hAnsi="Times New Roman"/>
+          <w:b w:val="0"/>
+          <w:i w:val="0"/>
           <w:sz w:val="24"/>
           <w:rFonts w:ascii="Times New Roman" w:hAnsi="Times New Roman" w:cs="Times New Roman" w:eastAsia="Times New Roman"/>
         </w:rPr>
@@ -4900,6 +5291,7 @@
         <w:rPr>
           <w:rFonts w:ascii="Times New Roman" w:hAnsi="Times New Roman"/>
           <w:b/>
+          <w:i w:val="0"/>
           <w:sz w:val="24"/>
           <w:rFonts w:ascii="Times New Roman" w:hAnsi="Times New Roman" w:cs="Times New Roman" w:eastAsia="Times New Roman"/>
         </w:rPr>
@@ -4908,6 +5300,8 @@
       <w:r>
         <w:rPr>
           <w:rFonts w:ascii="Times New Roman" w:hAnsi="Times New Roman"/>
+          <w:b w:val="0"/>
+          <w:i w:val="0"/>
           <w:sz w:val="24"/>
           <w:rFonts w:ascii="Times New Roman" w:hAnsi="Times New Roman" w:cs="Times New Roman" w:eastAsia="Times New Roman"/>
         </w:rPr>
@@ -4923,6 +5317,8 @@
       <w:r>
         <w:rPr>
           <w:rFonts w:ascii="Times New Roman" w:hAnsi="Times New Roman"/>
+          <w:b w:val="0"/>
+          <w:i w:val="0"/>
           <w:sz w:val="24"/>
           <w:rFonts w:ascii="Times New Roman" w:hAnsi="Times New Roman" w:cs="Times New Roman" w:eastAsia="Times New Roman"/>
         </w:rPr>
@@ -4938,6 +5334,8 @@
       <w:r>
         <w:rPr>
           <w:rFonts w:ascii="Times New Roman" w:hAnsi="Times New Roman"/>
+          <w:b w:val="0"/>
+          <w:i w:val="0"/>
           <w:sz w:val="24"/>
           <w:rFonts w:ascii="Times New Roman" w:hAnsi="Times New Roman" w:cs="Times New Roman" w:eastAsia="Times New Roman"/>
         </w:rPr>
@@ -4981,6 +5379,8 @@
       <w:r>
         <w:rPr>
           <w:rFonts w:ascii="Times New Roman" w:hAnsi="Times New Roman"/>
+          <w:b w:val="0"/>
+          <w:i w:val="0"/>
           <w:sz w:val="24"/>
           <w:rFonts w:ascii="Times New Roman" w:hAnsi="Times New Roman" w:cs="Times New Roman" w:eastAsia="Times New Roman"/>
         </w:rPr>
@@ -4996,6 +5396,8 @@
       <w:r>
         <w:rPr>
           <w:rFonts w:ascii="Times New Roman" w:hAnsi="Times New Roman"/>
+          <w:b w:val="0"/>
+          <w:i w:val="0"/>
           <w:sz w:val="24"/>
           <w:rFonts w:ascii="Times New Roman" w:hAnsi="Times New Roman" w:cs="Times New Roman" w:eastAsia="Times New Roman"/>
         </w:rPr>
@@ -5019,6 +5421,8 @@
       <w:r>
         <w:rPr>
           <w:rFonts w:ascii="Times New Roman" w:hAnsi="Times New Roman"/>
+          <w:b w:val="0"/>
+          <w:i w:val="0"/>
           <w:sz w:val="24"/>
           <w:rFonts w:ascii="Times New Roman" w:hAnsi="Times New Roman" w:cs="Times New Roman" w:eastAsia="Times New Roman"/>
         </w:rPr>
@@ -5042,6 +5446,8 @@
       <w:r>
         <w:rPr>
           <w:rFonts w:ascii="Times New Roman" w:hAnsi="Times New Roman"/>
+          <w:b w:val="0"/>
+          <w:i w:val="0"/>
           <w:sz w:val="24"/>
           <w:rFonts w:ascii="Times New Roman" w:hAnsi="Times New Roman" w:cs="Times New Roman" w:eastAsia="Times New Roman"/>
         </w:rPr>
@@ -5065,6 +5471,8 @@
       <w:r>
         <w:rPr>
           <w:rFonts w:ascii="Times New Roman" w:hAnsi="Times New Roman"/>
+          <w:b w:val="0"/>
+          <w:i w:val="0"/>
           <w:sz w:val="24"/>
           <w:rFonts w:ascii="Times New Roman" w:hAnsi="Times New Roman" w:cs="Times New Roman" w:eastAsia="Times New Roman"/>
         </w:rPr>
@@ -5088,6 +5496,8 @@
       <w:r>
         <w:rPr>
           <w:rFonts w:ascii="Times New Roman" w:hAnsi="Times New Roman"/>
+          <w:b w:val="0"/>
+          <w:i w:val="0"/>
           <w:sz w:val="24"/>
           <w:rFonts w:ascii="Times New Roman" w:hAnsi="Times New Roman" w:cs="Times New Roman" w:eastAsia="Times New Roman"/>
         </w:rPr>
@@ -5103,6 +5513,8 @@
       <w:r>
         <w:rPr>
           <w:rFonts w:ascii="Times New Roman" w:hAnsi="Times New Roman"/>
+          <w:b w:val="0"/>
+          <w:i w:val="0"/>
           <w:sz w:val="24"/>
           <w:rFonts w:ascii="Times New Roman" w:hAnsi="Times New Roman" w:cs="Times New Roman" w:eastAsia="Times New Roman"/>
         </w:rPr>
@@ -5118,6 +5530,8 @@
       <w:r>
         <w:rPr>
           <w:rFonts w:ascii="Times New Roman" w:hAnsi="Times New Roman"/>
+          <w:b w:val="0"/>
+          <w:i w:val="0"/>
           <w:sz w:val="24"/>
           <w:rFonts w:ascii="Times New Roman" w:hAnsi="Times New Roman" w:cs="Times New Roman" w:eastAsia="Times New Roman"/>
         </w:rPr>
@@ -5152,6 +5566,7 @@
         <w:rPr>
           <w:rFonts w:ascii="Times New Roman" w:hAnsi="Times New Roman"/>
           <w:b/>
+          <w:i w:val="0"/>
           <w:sz w:val="24"/>
           <w:rFonts w:ascii="Times New Roman" w:hAnsi="Times New Roman" w:cs="Times New Roman" w:eastAsia="Times New Roman"/>
         </w:rPr>
@@ -5160,6 +5575,8 @@
       <w:r>
         <w:rPr>
           <w:rFonts w:ascii="Times New Roman" w:hAnsi="Times New Roman"/>
+          <w:b w:val="0"/>
+          <w:i w:val="0"/>
           <w:sz w:val="24"/>
           <w:rFonts w:ascii="Times New Roman" w:hAnsi="Times New Roman" w:cs="Times New Roman" w:eastAsia="Times New Roman"/>
         </w:rPr>
@@ -5203,6 +5620,8 @@
       <w:r>
         <w:rPr>
           <w:rFonts w:ascii="Times New Roman" w:hAnsi="Times New Roman"/>
+          <w:b w:val="0"/>
+          <w:i w:val="0"/>
           <w:sz w:val="24"/>
           <w:rFonts w:ascii="Times New Roman" w:hAnsi="Times New Roman" w:cs="Times New Roman" w:eastAsia="Times New Roman"/>
         </w:rPr>
@@ -5218,6 +5637,8 @@
       <w:r>
         <w:rPr>
           <w:rFonts w:ascii="Times New Roman" w:hAnsi="Times New Roman"/>
+          <w:b w:val="0"/>
+          <w:i w:val="0"/>
           <w:sz w:val="24"/>
           <w:rFonts w:ascii="Times New Roman" w:hAnsi="Times New Roman" w:cs="Times New Roman" w:eastAsia="Times New Roman"/>
         </w:rPr>
@@ -5241,6 +5662,8 @@
       <w:r>
         <w:rPr>
           <w:rFonts w:ascii="Times New Roman" w:hAnsi="Times New Roman"/>
+          <w:b w:val="0"/>
+          <w:i w:val="0"/>
           <w:sz w:val="24"/>
           <w:rFonts w:ascii="Times New Roman" w:hAnsi="Times New Roman" w:cs="Times New Roman" w:eastAsia="Times New Roman"/>
         </w:rPr>
@@ -5264,6 +5687,8 @@
       <w:r>
         <w:rPr>
           <w:rFonts w:ascii="Times New Roman" w:hAnsi="Times New Roman"/>
+          <w:b w:val="0"/>
+          <w:i w:val="0"/>
           <w:sz w:val="24"/>
           <w:rFonts w:ascii="Times New Roman" w:hAnsi="Times New Roman" w:cs="Times New Roman" w:eastAsia="Times New Roman"/>
         </w:rPr>
@@ -5287,6 +5712,8 @@
       <w:r>
         <w:rPr>
           <w:rFonts w:ascii="Times New Roman" w:hAnsi="Times New Roman"/>
+          <w:b w:val="0"/>
+          <w:i w:val="0"/>
           <w:sz w:val="24"/>
           <w:rFonts w:ascii="Times New Roman" w:hAnsi="Times New Roman" w:cs="Times New Roman" w:eastAsia="Times New Roman"/>
         </w:rPr>
@@ -5310,6 +5737,8 @@
       <w:r>
         <w:rPr>
           <w:rFonts w:ascii="Times New Roman" w:hAnsi="Times New Roman"/>
+          <w:b w:val="0"/>
+          <w:i w:val="0"/>
           <w:sz w:val="24"/>
           <w:rFonts w:ascii="Times New Roman" w:hAnsi="Times New Roman" w:cs="Times New Roman" w:eastAsia="Times New Roman"/>
         </w:rPr>
@@ -5333,6 +5762,8 @@
       <w:r>
         <w:rPr>
           <w:rFonts w:ascii="Times New Roman" w:hAnsi="Times New Roman"/>
+          <w:b w:val="0"/>
+          <w:i w:val="0"/>
           <w:sz w:val="24"/>
           <w:rFonts w:ascii="Times New Roman" w:hAnsi="Times New Roman" w:cs="Times New Roman" w:eastAsia="Times New Roman"/>
         </w:rPr>
@@ -5348,6 +5779,8 @@
       <w:r>
         <w:rPr>
           <w:rFonts w:ascii="Times New Roman" w:hAnsi="Times New Roman"/>
+          <w:b w:val="0"/>
+          <w:i w:val="0"/>
           <w:sz w:val="24"/>
           <w:rFonts w:ascii="Times New Roman" w:hAnsi="Times New Roman" w:cs="Times New Roman" w:eastAsia="Times New Roman"/>
         </w:rPr>
@@ -5377,6 +5810,8 @@
       <w:r>
         <w:rPr>
           <w:rFonts w:ascii="Times New Roman" w:hAnsi="Times New Roman"/>
+          <w:b w:val="0"/>
+          <w:i w:val="0"/>
           <w:sz w:val="24"/>
           <w:rFonts w:ascii="Times New Roman" w:hAnsi="Times New Roman" w:cs="Times New Roman" w:eastAsia="Times New Roman"/>
         </w:rPr>
@@ -5392,6 +5827,8 @@
       <w:r>
         <w:rPr>
           <w:rFonts w:ascii="Times New Roman" w:hAnsi="Times New Roman"/>
+          <w:b w:val="0"/>
+          <w:i w:val="0"/>
           <w:sz w:val="24"/>
           <w:rFonts w:ascii="Times New Roman" w:hAnsi="Times New Roman" w:cs="Times New Roman" w:eastAsia="Times New Roman"/>
         </w:rPr>
@@ -5407,6 +5844,8 @@
       <w:r>
         <w:rPr>
           <w:rFonts w:ascii="Times New Roman" w:hAnsi="Times New Roman"/>
+          <w:b w:val="0"/>
+          <w:i w:val="0"/>
           <w:sz w:val="24"/>
           <w:rFonts w:ascii="Times New Roman" w:hAnsi="Times New Roman" w:cs="Times New Roman" w:eastAsia="Times New Roman"/>
         </w:rPr>
@@ -5464,6 +5903,8 @@
       <w:r>
         <w:rPr>
           <w:rFonts w:ascii="Times New Roman" w:hAnsi="Times New Roman"/>
+          <w:b w:val="0"/>
+          <w:i w:val="0"/>
           <w:sz w:val="24"/>
           <w:rFonts w:ascii="Times New Roman" w:hAnsi="Times New Roman" w:cs="Times New Roman" w:eastAsia="Times New Roman"/>
         </w:rPr>
@@ -5498,6 +5939,7 @@
         <w:rPr>
           <w:rFonts w:ascii="Times New Roman" w:hAnsi="Times New Roman"/>
           <w:b/>
+          <w:i w:val="0"/>
           <w:sz w:val="24"/>
           <w:rFonts w:ascii="Times New Roman" w:hAnsi="Times New Roman" w:cs="Times New Roman" w:eastAsia="Times New Roman"/>
         </w:rPr>
@@ -5506,6 +5948,8 @@
       <w:r>
         <w:rPr>
           <w:rFonts w:ascii="Times New Roman" w:hAnsi="Times New Roman"/>
+          <w:b w:val="0"/>
+          <w:i w:val="0"/>
           <w:sz w:val="24"/>
           <w:rFonts w:ascii="Times New Roman" w:hAnsi="Times New Roman" w:cs="Times New Roman" w:eastAsia="Times New Roman"/>
         </w:rPr>
@@ -5521,6 +5965,8 @@
       <w:r>
         <w:rPr>
           <w:rFonts w:ascii="Times New Roman" w:hAnsi="Times New Roman"/>
+          <w:b w:val="0"/>
+          <w:i w:val="0"/>
           <w:sz w:val="24"/>
           <w:rFonts w:ascii="Times New Roman" w:hAnsi="Times New Roman" w:cs="Times New Roman" w:eastAsia="Times New Roman"/>
         </w:rPr>
@@ -5564,6 +6010,8 @@
       <w:r>
         <w:rPr>
           <w:rFonts w:ascii="Times New Roman" w:hAnsi="Times New Roman"/>
+          <w:b w:val="0"/>
+          <w:i w:val="0"/>
           <w:sz w:val="24"/>
           <w:rFonts w:ascii="Times New Roman" w:hAnsi="Times New Roman" w:cs="Times New Roman" w:eastAsia="Times New Roman"/>
         </w:rPr>
@@ -5691,6 +6139,8 @@
       <w:r>
         <w:rPr>
           <w:rFonts w:ascii="Times New Roman" w:hAnsi="Times New Roman"/>
+          <w:b w:val="0"/>
+          <w:i w:val="0"/>
           <w:sz w:val="24"/>
           <w:rFonts w:ascii="Times New Roman" w:hAnsi="Times New Roman" w:cs="Times New Roman" w:eastAsia="Times New Roman"/>
         </w:rPr>
@@ -5714,6 +6164,8 @@
       <w:r>
         <w:rPr>
           <w:rFonts w:ascii="Times New Roman" w:hAnsi="Times New Roman"/>
+          <w:b w:val="0"/>
+          <w:i w:val="0"/>
           <w:sz w:val="24"/>
           <w:rFonts w:ascii="Times New Roman" w:hAnsi="Times New Roman" w:cs="Times New Roman" w:eastAsia="Times New Roman"/>
         </w:rPr>
@@ -5737,6 +6189,8 @@
       <w:r>
         <w:rPr>
           <w:rFonts w:ascii="Times New Roman" w:hAnsi="Times New Roman"/>
+          <w:b w:val="0"/>
+          <w:i w:val="0"/>
           <w:sz w:val="24"/>
           <w:rFonts w:ascii="Times New Roman" w:hAnsi="Times New Roman" w:cs="Times New Roman" w:eastAsia="Times New Roman"/>
         </w:rPr>
@@ -5760,6 +6214,8 @@
       <w:r>
         <w:rPr>
           <w:rFonts w:ascii="Times New Roman" w:hAnsi="Times New Roman"/>
+          <w:b w:val="0"/>
+          <w:i w:val="0"/>
           <w:sz w:val="24"/>
           <w:rFonts w:ascii="Times New Roman" w:hAnsi="Times New Roman" w:cs="Times New Roman" w:eastAsia="Times New Roman"/>
         </w:rPr>
@@ -5783,6 +6239,8 @@
       <w:r>
         <w:rPr>
           <w:rFonts w:ascii="Times New Roman" w:hAnsi="Times New Roman"/>
+          <w:b w:val="0"/>
+          <w:i w:val="0"/>
           <w:sz w:val="24"/>
           <w:rFonts w:ascii="Times New Roman" w:hAnsi="Times New Roman" w:cs="Times New Roman" w:eastAsia="Times New Roman"/>
         </w:rPr>
@@ -5806,6 +6264,8 @@
       <w:r>
         <w:rPr>
           <w:rFonts w:ascii="Times New Roman" w:hAnsi="Times New Roman"/>
+          <w:b w:val="0"/>
+          <w:i w:val="0"/>
           <w:sz w:val="24"/>
           <w:rFonts w:ascii="Times New Roman" w:hAnsi="Times New Roman" w:cs="Times New Roman" w:eastAsia="Times New Roman"/>
         </w:rPr>
@@ -5821,6 +6281,8 @@
       <w:r>
         <w:rPr>
           <w:rFonts w:ascii="Times New Roman" w:hAnsi="Times New Roman"/>
+          <w:b w:val="0"/>
+          <w:i w:val="0"/>
           <w:sz w:val="24"/>
           <w:rFonts w:ascii="Times New Roman" w:hAnsi="Times New Roman" w:cs="Times New Roman" w:eastAsia="Times New Roman"/>
         </w:rPr>
@@ -5836,6 +6298,8 @@
       <w:r>
         <w:rPr>
           <w:rFonts w:ascii="Times New Roman" w:hAnsi="Times New Roman"/>
+          <w:b w:val="0"/>
+          <w:i w:val="0"/>
           <w:sz w:val="24"/>
           <w:rFonts w:ascii="Times New Roman" w:hAnsi="Times New Roman" w:cs="Times New Roman" w:eastAsia="Times New Roman"/>
         </w:rPr>
@@ -5851,6 +6315,8 @@
       <w:r>
         <w:rPr>
           <w:rFonts w:ascii="Times New Roman" w:hAnsi="Times New Roman"/>
+          <w:b w:val="0"/>
+          <w:i w:val="0"/>
           <w:sz w:val="24"/>
           <w:rFonts w:ascii="Times New Roman" w:hAnsi="Times New Roman" w:cs="Times New Roman" w:eastAsia="Times New Roman"/>
         </w:rPr>
@@ -5885,6 +6351,7 @@
         <w:rPr>
           <w:rFonts w:ascii="Times New Roman" w:hAnsi="Times New Roman"/>
           <w:b/>
+          <w:i w:val="0"/>
           <w:sz w:val="24"/>
           <w:rFonts w:ascii="Times New Roman" w:hAnsi="Times New Roman" w:cs="Times New Roman" w:eastAsia="Times New Roman"/>
         </w:rPr>
@@ -5893,6 +6360,8 @@
       <w:r>
         <w:rPr>
           <w:rFonts w:ascii="Times New Roman" w:hAnsi="Times New Roman"/>
+          <w:b w:val="0"/>
+          <w:i w:val="0"/>
           <w:sz w:val="24"/>
           <w:rFonts w:ascii="Times New Roman" w:hAnsi="Times New Roman" w:cs="Times New Roman" w:eastAsia="Times New Roman"/>
         </w:rPr>
@@ -5908,6 +6377,8 @@
       <w:r>
         <w:rPr>
           <w:rFonts w:ascii="Times New Roman" w:hAnsi="Times New Roman"/>
+          <w:b w:val="0"/>
+          <w:i w:val="0"/>
           <w:sz w:val="24"/>
           <w:rFonts w:ascii="Times New Roman" w:hAnsi="Times New Roman" w:cs="Times New Roman" w:eastAsia="Times New Roman"/>
         </w:rPr>
@@ -5979,6 +6450,8 @@
       <w:r>
         <w:rPr>
           <w:rFonts w:ascii="Times New Roman" w:hAnsi="Times New Roman"/>
+          <w:b w:val="0"/>
+          <w:i w:val="0"/>
           <w:sz w:val="24"/>
           <w:rFonts w:ascii="Times New Roman" w:hAnsi="Times New Roman" w:cs="Times New Roman" w:eastAsia="Times New Roman"/>
         </w:rPr>
@@ -6002,6 +6475,8 @@
       <w:r>
         <w:rPr>
           <w:rFonts w:ascii="Times New Roman" w:hAnsi="Times New Roman"/>
+          <w:b w:val="0"/>
+          <w:i w:val="0"/>
           <w:sz w:val="24"/>
           <w:rFonts w:ascii="Times New Roman" w:hAnsi="Times New Roman" w:cs="Times New Roman" w:eastAsia="Times New Roman"/>
         </w:rPr>
@@ -6025,6 +6500,8 @@
       <w:r>
         <w:rPr>
           <w:rFonts w:ascii="Times New Roman" w:hAnsi="Times New Roman"/>
+          <w:b w:val="0"/>
+          <w:i w:val="0"/>
           <w:sz w:val="24"/>
           <w:rFonts w:ascii="Times New Roman" w:hAnsi="Times New Roman" w:cs="Times New Roman" w:eastAsia="Times New Roman"/>
         </w:rPr>
@@ -6048,6 +6525,8 @@
       <w:r>
         <w:rPr>
           <w:rFonts w:ascii="Times New Roman" w:hAnsi="Times New Roman"/>
+          <w:b w:val="0"/>
+          <w:i w:val="0"/>
           <w:sz w:val="24"/>
           <w:rFonts w:ascii="Times New Roman" w:hAnsi="Times New Roman" w:cs="Times New Roman" w:eastAsia="Times New Roman"/>
         </w:rPr>
@@ -6071,6 +6550,8 @@
       <w:r>
         <w:rPr>
           <w:rFonts w:ascii="Times New Roman" w:hAnsi="Times New Roman"/>
+          <w:b w:val="0"/>
+          <w:i w:val="0"/>
           <w:sz w:val="24"/>
           <w:rFonts w:ascii="Times New Roman" w:hAnsi="Times New Roman" w:cs="Times New Roman" w:eastAsia="Times New Roman"/>
         </w:rPr>
@@ -6086,6 +6567,8 @@
       <w:r>
         <w:rPr>
           <w:rFonts w:ascii="Times New Roman" w:hAnsi="Times New Roman"/>
+          <w:b w:val="0"/>
+          <w:i w:val="0"/>
           <w:sz w:val="24"/>
           <w:rFonts w:ascii="Times New Roman" w:hAnsi="Times New Roman" w:cs="Times New Roman" w:eastAsia="Times New Roman"/>
         </w:rPr>
@@ -6143,6 +6626,8 @@
       <w:r>
         <w:rPr>
           <w:rFonts w:ascii="Times New Roman" w:hAnsi="Times New Roman"/>
+          <w:b w:val="0"/>
+          <w:i w:val="0"/>
           <w:sz w:val="24"/>
           <w:rFonts w:ascii="Times New Roman" w:hAnsi="Times New Roman" w:cs="Times New Roman" w:eastAsia="Times New Roman"/>
         </w:rPr>
@@ -6166,6 +6651,8 @@
       <w:r>
         <w:rPr>
           <w:rFonts w:ascii="Times New Roman" w:hAnsi="Times New Roman"/>
+          <w:b w:val="0"/>
+          <w:i w:val="0"/>
           <w:sz w:val="24"/>
           <w:rFonts w:ascii="Times New Roman" w:hAnsi="Times New Roman" w:cs="Times New Roman" w:eastAsia="Times New Roman"/>
         </w:rPr>
@@ -6189,6 +6676,8 @@
       <w:r>
         <w:rPr>
           <w:rFonts w:ascii="Times New Roman" w:hAnsi="Times New Roman"/>
+          <w:b w:val="0"/>
+          <w:i w:val="0"/>
           <w:sz w:val="24"/>
           <w:rFonts w:ascii="Times New Roman" w:hAnsi="Times New Roman" w:cs="Times New Roman" w:eastAsia="Times New Roman"/>
         </w:rPr>
@@ -6212,6 +6701,8 @@
       <w:r>
         <w:rPr>
           <w:rFonts w:ascii="Times New Roman" w:hAnsi="Times New Roman"/>
+          <w:b w:val="0"/>
+          <w:i w:val="0"/>
           <w:sz w:val="24"/>
           <w:rFonts w:ascii="Times New Roman" w:hAnsi="Times New Roman" w:cs="Times New Roman" w:eastAsia="Times New Roman"/>
         </w:rPr>
@@ -6235,6 +6726,8 @@
       <w:r>
         <w:rPr>
           <w:rFonts w:ascii="Times New Roman" w:hAnsi="Times New Roman"/>
+          <w:b w:val="0"/>
+          <w:i w:val="0"/>
           <w:sz w:val="24"/>
           <w:rFonts w:ascii="Times New Roman" w:hAnsi="Times New Roman" w:cs="Times New Roman" w:eastAsia="Times New Roman"/>
         </w:rPr>
@@ -6287,6 +6780,7 @@
         <w:rPr>
           <w:rFonts w:ascii="Times New Roman" w:hAnsi="Times New Roman"/>
           <w:b/>
+          <w:i w:val="0"/>
           <w:sz w:val="24"/>
           <w:rFonts w:ascii="Times New Roman" w:hAnsi="Times New Roman" w:cs="Times New Roman" w:eastAsia="Times New Roman"/>
         </w:rPr>
@@ -6295,6 +6789,8 @@
       <w:r>
         <w:rPr>
           <w:rFonts w:ascii="Times New Roman" w:hAnsi="Times New Roman"/>
+          <w:b w:val="0"/>
+          <w:i w:val="0"/>
           <w:sz w:val="24"/>
           <w:rFonts w:ascii="Times New Roman" w:hAnsi="Times New Roman" w:cs="Times New Roman" w:eastAsia="Times New Roman"/>
         </w:rPr>
@@ -6319,6 +6815,7 @@
         <w:rPr>
           <w:rFonts w:ascii="Times New Roman" w:hAnsi="Times New Roman"/>
           <w:b/>
+          <w:i w:val="0"/>
           <w:sz w:val="24"/>
           <w:rFonts w:ascii="Times New Roman" w:hAnsi="Times New Roman" w:cs="Times New Roman" w:eastAsia="Times New Roman"/>
         </w:rPr>
@@ -6327,6 +6824,8 @@
       <w:r>
         <w:rPr>
           <w:rFonts w:ascii="Times New Roman" w:hAnsi="Times New Roman"/>
+          <w:b w:val="0"/>
+          <w:i w:val="0"/>
           <w:sz w:val="24"/>
           <w:rFonts w:ascii="Times New Roman" w:hAnsi="Times New Roman" w:cs="Times New Roman" w:eastAsia="Times New Roman"/>
         </w:rPr>
@@ -6335,6 +6834,7 @@
       <w:r>
         <w:rPr>
           <w:rFonts w:ascii="Times New Roman" w:hAnsi="Times New Roman"/>
+          <w:b w:val="0"/>
           <w:i/>
           <w:sz w:val="24"/>
           <w:rFonts w:ascii="Times New Roman" w:hAnsi="Times New Roman" w:cs="Times New Roman" w:eastAsia="Times New Roman"/>
@@ -6344,6 +6844,8 @@
       <w:r>
         <w:rPr>
           <w:rFonts w:ascii="Times New Roman" w:hAnsi="Times New Roman"/>
+          <w:b w:val="0"/>
+          <w:i w:val="0"/>
           <w:sz w:val="24"/>
           <w:rFonts w:ascii="Times New Roman" w:hAnsi="Times New Roman" w:cs="Times New Roman" w:eastAsia="Times New Roman"/>
         </w:rPr>
@@ -6368,6 +6870,7 @@
         <w:rPr>
           <w:rFonts w:ascii="Times New Roman" w:hAnsi="Times New Roman"/>
           <w:b/>
+          <w:i w:val="0"/>
           <w:sz w:val="24"/>
           <w:rFonts w:ascii="Times New Roman" w:hAnsi="Times New Roman" w:cs="Times New Roman" w:eastAsia="Times New Roman"/>
         </w:rPr>
@@ -6376,6 +6879,8 @@
       <w:r>
         <w:rPr>
           <w:rFonts w:ascii="Times New Roman" w:hAnsi="Times New Roman"/>
+          <w:b w:val="0"/>
+          <w:i w:val="0"/>
           <w:sz w:val="24"/>
           <w:rFonts w:ascii="Times New Roman" w:hAnsi="Times New Roman" w:cs="Times New Roman" w:eastAsia="Times New Roman"/>
         </w:rPr>
@@ -6400,6 +6905,7 @@
         <w:rPr>
           <w:rFonts w:ascii="Times New Roman" w:hAnsi="Times New Roman"/>
           <w:b/>
+          <w:i w:val="0"/>
           <w:sz w:val="24"/>
           <w:rFonts w:ascii="Times New Roman" w:hAnsi="Times New Roman" w:cs="Times New Roman" w:eastAsia="Times New Roman"/>
         </w:rPr>
@@ -6408,6 +6914,8 @@
       <w:r>
         <w:rPr>
           <w:rFonts w:ascii="Times New Roman" w:hAnsi="Times New Roman"/>
+          <w:b w:val="0"/>
+          <w:i w:val="0"/>
           <w:sz w:val="24"/>
           <w:rFonts w:ascii="Times New Roman" w:hAnsi="Times New Roman" w:cs="Times New Roman" w:eastAsia="Times New Roman"/>
         </w:rPr>
@@ -6432,6 +6940,7 @@
         <w:rPr>
           <w:rFonts w:ascii="Times New Roman" w:hAnsi="Times New Roman"/>
           <w:b/>
+          <w:i w:val="0"/>
           <w:sz w:val="24"/>
           <w:rFonts w:ascii="Times New Roman" w:hAnsi="Times New Roman" w:cs="Times New Roman" w:eastAsia="Times New Roman"/>
         </w:rPr>
@@ -6440,6 +6949,8 @@
       <w:r>
         <w:rPr>
           <w:rFonts w:ascii="Times New Roman" w:hAnsi="Times New Roman"/>
+          <w:b w:val="0"/>
+          <w:i w:val="0"/>
           <w:sz w:val="24"/>
           <w:rFonts w:ascii="Times New Roman" w:hAnsi="Times New Roman" w:cs="Times New Roman" w:eastAsia="Times New Roman"/>
         </w:rPr>
@@ -6455,6 +6966,8 @@
       <w:r>
         <w:rPr>
           <w:rFonts w:ascii="Times New Roman" w:hAnsi="Times New Roman"/>
+          <w:b w:val="0"/>
+          <w:i w:val="0"/>
           <w:sz w:val="24"/>
           <w:rFonts w:ascii="Times New Roman" w:hAnsi="Times New Roman" w:cs="Times New Roman" w:eastAsia="Times New Roman"/>
         </w:rPr>
@@ -6489,6 +7002,7 @@
         <w:rPr>
           <w:rFonts w:ascii="Times New Roman" w:hAnsi="Times New Roman"/>
           <w:b/>
+          <w:i w:val="0"/>
           <w:sz w:val="24"/>
           <w:rFonts w:ascii="Times New Roman" w:hAnsi="Times New Roman" w:cs="Times New Roman" w:eastAsia="Times New Roman"/>
         </w:rPr>
@@ -6497,6 +7011,8 @@
       <w:r>
         <w:rPr>
           <w:rFonts w:ascii="Times New Roman" w:hAnsi="Times New Roman"/>
+          <w:b w:val="0"/>
+          <w:i w:val="0"/>
           <w:sz w:val="24"/>
           <w:rFonts w:ascii="Times New Roman" w:hAnsi="Times New Roman" w:cs="Times New Roman" w:eastAsia="Times New Roman"/>
         </w:rPr>
@@ -6521,6 +7037,7 @@
         <w:rPr>
           <w:rFonts w:ascii="Times New Roman" w:hAnsi="Times New Roman"/>
           <w:b/>
+          <w:i w:val="0"/>
           <w:sz w:val="24"/>
           <w:rFonts w:ascii="Times New Roman" w:hAnsi="Times New Roman" w:cs="Times New Roman" w:eastAsia="Times New Roman"/>
         </w:rPr>
@@ -6529,6 +7046,8 @@
       <w:r>
         <w:rPr>
           <w:rFonts w:ascii="Times New Roman" w:hAnsi="Times New Roman"/>
+          <w:b w:val="0"/>
+          <w:i w:val="0"/>
           <w:sz w:val="24"/>
           <w:rFonts w:ascii="Times New Roman" w:hAnsi="Times New Roman" w:cs="Times New Roman" w:eastAsia="Times New Roman"/>
         </w:rPr>
@@ -6553,6 +7072,7 @@
         <w:rPr>
           <w:rFonts w:ascii="Times New Roman" w:hAnsi="Times New Roman"/>
           <w:b/>
+          <w:i w:val="0"/>
           <w:sz w:val="24"/>
           <w:rFonts w:ascii="Times New Roman" w:hAnsi="Times New Roman" w:cs="Times New Roman" w:eastAsia="Times New Roman"/>
         </w:rPr>
@@ -6561,6 +7081,8 @@
       <w:r>
         <w:rPr>
           <w:rFonts w:ascii="Times New Roman" w:hAnsi="Times New Roman"/>
+          <w:b w:val="0"/>
+          <w:i w:val="0"/>
           <w:sz w:val="24"/>
           <w:rFonts w:ascii="Times New Roman" w:hAnsi="Times New Roman" w:cs="Times New Roman" w:eastAsia="Times New Roman"/>
         </w:rPr>
@@ -6585,6 +7107,7 @@
         <w:rPr>
           <w:rFonts w:ascii="Times New Roman" w:hAnsi="Times New Roman"/>
           <w:b/>
+          <w:i w:val="0"/>
           <w:sz w:val="24"/>
           <w:rFonts w:ascii="Times New Roman" w:hAnsi="Times New Roman" w:cs="Times New Roman" w:eastAsia="Times New Roman"/>
         </w:rPr>
@@ -6593,6 +7116,8 @@
       <w:r>
         <w:rPr>
           <w:rFonts w:ascii="Times New Roman" w:hAnsi="Times New Roman"/>
+          <w:b w:val="0"/>
+          <w:i w:val="0"/>
           <w:sz w:val="24"/>
           <w:rFonts w:ascii="Times New Roman" w:hAnsi="Times New Roman" w:cs="Times New Roman" w:eastAsia="Times New Roman"/>
         </w:rPr>

</xml_diff>

<commit_message>
Tich hop chuc nang gui SMS canh bao han muc nang luong va chong spam tin nhan
</commit_message>
<xml_diff>
--- a/Cẩm_Nang_Phản_Biện_Đồ_Án.docx
+++ b/Cẩm_Nang_Phản_Biện_Đồ_Án.docx
@@ -7124,6 +7124,193 @@
         <w:t xml:space="preserve"> Bảng nhật ký `audit_logs` đóng vai trò là nhật ký vận hành trạm. Khi có sự cố quá tải hoặc thiết bị bị ngắt, kỹ sư điện có thể tra cứu lịch sử để phân tích xem đây là do thuật toán tự động sa thải tải (Auto-shedding) hay do con người điều khiển sai để khắc phục.</w:t>
       </w:r>
     </w:p>
+    <w:p>
+      <w:pPr>
+        <w:spacing w:before="60" w:after="60" w:line="276" w:lineRule="auto"/>
+        <w:ind w:firstLine="283"/>
+        <w:jc w:val="both"/>
+      </w:pPr>
+      <w:r>
+        <w:rPr>
+          <w:rFonts w:ascii="Times New Roman" w:hAnsi="Times New Roman"/>
+          <w:b w:val="0"/>
+          <w:i w:val="0"/>
+          <w:sz w:val="24"/>
+          <w:rFonts w:ascii="Times New Roman" w:hAnsi="Times New Roman" w:cs="Times New Roman" w:eastAsia="Times New Roman"/>
+        </w:rPr>
+        <w:t>---</w:t>
+      </w:r>
+    </w:p>
+    <w:p>
+      <w:pPr>
+        <w:keepNext/>
+        <w:spacing w:before="240" w:after="120"/>
+        <w:ind w:firstLine="0"/>
+        <w:jc w:val="left"/>
+      </w:pPr>
+      <w:r>
+        <w:rPr>
+          <w:rFonts w:ascii="Times New Roman" w:hAnsi="Times New Roman"/>
+          <w:b w:val="0"/>
+          <w:i/>
+          <w:sz w:val="24"/>
+          <w:rFonts w:ascii="Times New Roman" w:hAnsi="Times New Roman" w:cs="Times New Roman" w:eastAsia="Times New Roman"/>
+        </w:rPr>
+        <w:t>Câu hỏi 23: Tại sao hệ thống lại tích hợp thêm tính năng cảnh báo qua SMS? Chức năng này có vai trò điều khiển đóng cắt thiết bị hay không?</w:t>
+      </w:r>
+    </w:p>
+    <w:p>
+      <w:pPr>
+        <w:spacing w:before="60" w:after="60" w:line="276" w:lineRule="auto"/>
+        <w:ind w:firstLine="283"/>
+        <w:jc w:val="both"/>
+      </w:pPr>
+      <w:r>
+        <w:rPr>
+          <w:rFonts w:ascii="Times New Roman" w:hAnsi="Times New Roman"/>
+          <w:b/>
+          <w:i w:val="0"/>
+          <w:sz w:val="24"/>
+          <w:rFonts w:ascii="Times New Roman" w:hAnsi="Times New Roman" w:cs="Times New Roman" w:eastAsia="Times New Roman"/>
+        </w:rPr>
+        <w:t>Trả lời:</w:t>
+      </w:r>
+      <w:r>
+        <w:rPr>
+          <w:rFonts w:ascii="Times New Roman" w:hAnsi="Times New Roman"/>
+          <w:b w:val="0"/>
+          <w:i w:val="0"/>
+          <w:sz w:val="24"/>
+          <w:rFonts w:ascii="Times New Roman" w:hAnsi="Times New Roman" w:cs="Times New Roman" w:eastAsia="Times New Roman"/>
+        </w:rPr>
+        <w:t xml:space="preserve"> Hệ thống tích hợp SMS như một kênh cảnh báo mở rộng bên cạnh thông báo đẩy trên ứng dụng di động để đảm bảo độ tin cậy thông tin:</w:t>
+      </w:r>
+    </w:p>
+    <w:p>
+      <w:pPr>
+        <w:spacing w:before="40" w:after="40"/>
+        <w:ind w:left="283" w:hanging="142"/>
+      </w:pPr>
+      <w:r>
+        <w:rPr>
+          <w:rFonts w:ascii="Times New Roman" w:hAnsi="Times New Roman"/>
+          <w:b/>
+          <w:sz w:val="24"/>
+          <w:rFonts w:ascii="Times New Roman" w:hAnsi="Times New Roman" w:cs="Times New Roman" w:eastAsia="Times New Roman"/>
+        </w:rPr>
+        <w:t xml:space="preserve">1.  </w:t>
+      </w:r>
+      <w:r>
+        <w:rPr>
+          <w:rFonts w:ascii="Times New Roman" w:hAnsi="Times New Roman"/>
+          <w:b/>
+          <w:i w:val="0"/>
+          <w:sz w:val="24"/>
+          <w:rFonts w:ascii="Times New Roman" w:hAnsi="Times New Roman" w:cs="Times New Roman" w:eastAsia="Times New Roman"/>
+        </w:rPr>
+        <w:t>Bảo đảm thông tin truyền suốt:</w:t>
+      </w:r>
+      <w:r>
+        <w:rPr>
+          <w:rFonts w:ascii="Times New Roman" w:hAnsi="Times New Roman"/>
+          <w:b w:val="0"/>
+          <w:i w:val="0"/>
+          <w:sz w:val="24"/>
+          <w:rFonts w:ascii="Times New Roman" w:hAnsi="Times New Roman" w:cs="Times New Roman" w:eastAsia="Times New Roman"/>
+        </w:rPr>
+        <w:t xml:space="preserve"> Thông báo đẩy (push notification) trên ứng dụng phụ thuộc vào kết nối mạng internet 3G/4G/Wi-Fi của điện thoại. Trong trường hợp điện thoại chủ nhà mất mạng nhưng vẫn có sóng viễn thông, tin nhắn SMS là kênh dự phòng khẩn cấp tối ưu để họ nhận được cảnh báo vượt quota điện năng tháng.</w:t>
+      </w:r>
+    </w:p>
+    <w:p>
+      <w:pPr>
+        <w:spacing w:before="40" w:after="40"/>
+        <w:ind w:left="283" w:hanging="142"/>
+      </w:pPr>
+      <w:r>
+        <w:rPr>
+          <w:rFonts w:ascii="Times New Roman" w:hAnsi="Times New Roman"/>
+          <w:b/>
+          <w:sz w:val="24"/>
+          <w:rFonts w:ascii="Times New Roman" w:hAnsi="Times New Roman" w:cs="Times New Roman" w:eastAsia="Times New Roman"/>
+        </w:rPr>
+        <w:t xml:space="preserve">2.  </w:t>
+      </w:r>
+      <w:r>
+        <w:rPr>
+          <w:rFonts w:ascii="Times New Roman" w:hAnsi="Times New Roman"/>
+          <w:b/>
+          <w:i w:val="0"/>
+          <w:sz w:val="24"/>
+          <w:rFonts w:ascii="Times New Roman" w:hAnsi="Times New Roman" w:cs="Times New Roman" w:eastAsia="Times New Roman"/>
+        </w:rPr>
+        <w:t>Cảnh báo khẩn cấp có chọn lọc:</w:t>
+      </w:r>
+      <w:r>
+        <w:rPr>
+          <w:rFonts w:ascii="Times New Roman" w:hAnsi="Times New Roman"/>
+          <w:b w:val="0"/>
+          <w:i w:val="0"/>
+          <w:sz w:val="24"/>
+          <w:rFonts w:ascii="Times New Roman" w:hAnsi="Times New Roman" w:cs="Times New Roman" w:eastAsia="Times New Roman"/>
+        </w:rPr>
+        <w:t xml:space="preserve"> SMS chỉ được gửi khi điện năng sử dụng đạt các ngưỡng quan trọng (90%, 100%) và tích hợp giải thuật giới hạn tần suất (rate-limiting) chỉ gửi một lần duy nhất cho mỗi ngưỡng để tránh gây phiền hà và tốn kém chi phí cho chủ hộ.</w:t>
+      </w:r>
+    </w:p>
+    <w:p>
+      <w:pPr>
+        <w:spacing w:before="40" w:after="40"/>
+        <w:ind w:left="283" w:hanging="142"/>
+      </w:pPr>
+      <w:r>
+        <w:rPr>
+          <w:rFonts w:ascii="Times New Roman" w:hAnsi="Times New Roman"/>
+          <w:b/>
+          <w:sz w:val="24"/>
+          <w:rFonts w:ascii="Times New Roman" w:hAnsi="Times New Roman" w:cs="Times New Roman" w:eastAsia="Times New Roman"/>
+        </w:rPr>
+        <w:t xml:space="preserve">3.  </w:t>
+      </w:r>
+      <w:r>
+        <w:rPr>
+          <w:rFonts w:ascii="Times New Roman" w:hAnsi="Times New Roman"/>
+          <w:b/>
+          <w:i w:val="0"/>
+          <w:sz w:val="24"/>
+          <w:rFonts w:ascii="Times New Roman" w:hAnsi="Times New Roman" w:cs="Times New Roman" w:eastAsia="Times New Roman"/>
+        </w:rPr>
+        <w:t>An toàn bảo mật (OT Security):</w:t>
+      </w:r>
+      <w:r>
+        <w:rPr>
+          <w:rFonts w:ascii="Times New Roman" w:hAnsi="Times New Roman"/>
+          <w:b w:val="0"/>
+          <w:i w:val="0"/>
+          <w:sz w:val="24"/>
+          <w:rFonts w:ascii="Times New Roman" w:hAnsi="Times New Roman" w:cs="Times New Roman" w:eastAsia="Times New Roman"/>
+        </w:rPr>
+        <w:t xml:space="preserve"> SMS trong hệ thống này </w:t>
+      </w:r>
+      <w:r>
+        <w:rPr>
+          <w:rFonts w:ascii="Times New Roman" w:hAnsi="Times New Roman"/>
+          <w:b/>
+          <w:i w:val="0"/>
+          <w:sz w:val="24"/>
+          <w:rFonts w:ascii="Times New Roman" w:hAnsi="Times New Roman" w:cs="Times New Roman" w:eastAsia="Times New Roman"/>
+        </w:rPr>
+        <w:t>thuần túy là kênh cảnh báo một chiều (notification-only)</w:t>
+      </w:r>
+      <w:r>
+        <w:rPr>
+          <w:rFonts w:ascii="Times New Roman" w:hAnsi="Times New Roman"/>
+          <w:b w:val="0"/>
+          <w:i w:val="0"/>
+          <w:sz w:val="24"/>
+          <w:rFonts w:ascii="Times New Roman" w:hAnsi="Times New Roman" w:cs="Times New Roman" w:eastAsia="Times New Roman"/>
+        </w:rPr>
+        <w:t>, không hỗ trợ bất kỳ cú pháp tin nhắn nào để điều khiển đóng/cắt thiết bị điện từ xa hay tác động trực tiếp xuống PLC S7-1200. Điều này loại bỏ hoàn toàn nguy cơ kẻ tấn công giả mạo tin nhắn SMS để can thiệp trái phép vào hệ thống điện gia đình, đảm bảo an toàn vận hành ở biên.</w:t>
+      </w:r>
+    </w:p>
     <w:sectPr>
       <w:pgSz w:w="11906" w:h="16838"/>
       <w:pgMar w:top="1134" w:right="1134" w:bottom="1134" w:left="1134" w:header="720" w:footer="720" w:gutter="0"/>

</xml_diff>